<commit_message>
feat: ID Card mode select, album picker, NEW badge on file list
- Rename ID Card guide page to Mode Select (no title)
- Back from shoot with front captured shows discard dialog
- Mode reset when returning to Mode Select
- Scan/ID Card tabs hidden on shoot page
- Album picker uses mock images (2 for ID Card, 1 for Passport/Single)
- Single Side shows correct title during capture
- NEW badge on PDF file list: created <24h AND not yet opened
- Viewed state persisted in localStorage
- PRD and docx updated
</commit_message>
<xml_diff>
--- a/PRD-updated.docx
+++ b/PRD-updated.docx
@@ -2,7 +2,7 @@
 <file path=word/document.xml><?xml version="1.0" encoding="utf-8"?>
 <w:document xmlns:w="http://schemas.openxmlformats.org/wordprocessingml/2006/main" xmlns:m="http://schemas.openxmlformats.org/officeDocument/2006/math" xmlns:r="http://schemas.openxmlformats.org/officeDocument/2006/relationships" xmlns:o="urn:schemas-microsoft-com:office:office" xmlns:v="urn:schemas-microsoft-com:vml" xmlns:w10="urn:schemas-microsoft-com:office:word" xmlns:a="http://schemas.openxmlformats.org/drawingml/2006/main" xmlns:pic="http://schemas.openxmlformats.org/drawingml/2006/picture" xmlns:wp="http://schemas.openxmlformats.org/drawingml/2006/wordprocessingDrawing">
   <w:body>
-    <w:bookmarkStart w:id="54" w:name="X4124105218abde2f58959ba38406d704e8d86fd"/>
+    <w:bookmarkStart w:id="66" w:name="X4124105218abde2f58959ba38406d704e8d86fd"/>
     <w:p>
       <w:pPr>
         <w:pStyle w:val="Heading1"/>
@@ -408,6 +408,39 @@
       </w:r>
       <w:r>
         <w:t xml:space="preserve">- Modification date</w:t>
+      </w:r>
+      <w:r>
+        <w:t xml:space="preserve"> </w:t>
+      </w:r>
+      <w:r>
+        <w:t xml:space="preserve">-</w:t>
+      </w:r>
+      <w:r>
+        <w:t xml:space="preserve"> </w:t>
+      </w:r>
+      <w:r>
+        <w:rPr>
+          <w:b/>
+          <w:bCs/>
+        </w:rPr>
+        <w:t xml:space="preserve">“NEW”</w:t>
+      </w:r>
+      <w:r>
+        <w:rPr>
+          <w:b/>
+          <w:bCs/>
+        </w:rPr>
+        <w:t xml:space="preserve"> </w:t>
+      </w:r>
+      <w:r>
+        <w:rPr>
+          <w:b/>
+          <w:bCs/>
+        </w:rPr>
+        <w:t xml:space="preserve">badge</w:t>
+      </w:r>
+      <w:r>
+        <w:t xml:space="preserve">: Shown when file was created within the last 24 hours AND user has not opened it yet. Badge disappears once either condition is no longer met. Viewed state is persisted in localStorage.</w:t>
       </w:r>
     </w:p>
     <w:p>
@@ -925,7 +958,7 @@
         <w:t xml:space="preserve"> </w:t>
       </w:r>
       <w:r>
-        <w:t xml:space="preserve">‘my-document.pdf’</w:t>
+        <w:t xml:space="preserve">‘Image_[timestamp].pdf’</w:t>
       </w:r>
       <w:r>
         <w:t xml:space="preserve">, user can rename</w:t>
@@ -2206,7 +2239,7 @@
         <w:t xml:space="preserve"> </w:t>
       </w:r>
       <w:r>
-        <w:t xml:space="preserve">- File Naming based on type: IDCard_[date].pdf / Passport_[date].pdf / SinglePage_[date].pdf</w:t>
+        <w:t xml:space="preserve">- File Naming based on type: IDCard_[timestamp].pdf / Passport_[timestamp].pdf / SinglePage_[timestamp].pdf</w:t>
       </w:r>
       <w:r>
         <w:t xml:space="preserve"> </w:t>
@@ -2227,13 +2260,13 @@
         <w:t xml:space="preserve">User Flow:</w:t>
       </w:r>
     </w:p>
-    <w:bookmarkStart w:id="28" w:name="step-1-guide-page"/>
+    <w:bookmarkStart w:id="28" w:name="step-1-mode-select"/>
     <w:p>
       <w:pPr>
         <w:pStyle w:val="Heading3"/>
       </w:pPr>
       <w:r>
-        <w:t xml:space="preserve">Step 1: Guide Page</w:t>
+        <w:t xml:space="preserve">Step 1: Mode Select</w:t>
       </w:r>
     </w:p>
     <w:p>
@@ -2245,6 +2278,24 @@
         </w:numPr>
       </w:pPr>
       <w:r>
+        <w:t xml:space="preserve">Title:</w:t>
+      </w:r>
+      <w:r>
+        <w:t xml:space="preserve"> </w:t>
+      </w:r>
+      <w:r>
+        <w:t xml:space="preserve">“Mode Select”</w:t>
+      </w:r>
+    </w:p>
+    <w:p>
+      <w:pPr>
+        <w:pStyle w:val="Compact"/>
+        <w:numPr>
+          <w:ilvl w:val="0"/>
+          <w:numId w:val="1009"/>
+        </w:numPr>
+      </w:pPr>
+      <w:r>
         <w:t xml:space="preserve">Camera preview with overlay card showing mock ID card layout</w:t>
       </w:r>
     </w:p>
@@ -2372,6 +2423,18 @@
       </w:r>
       <w:r>
         <w:t xml:space="preserve">tabs to switch to Scan to PDF</w:t>
+      </w:r>
+    </w:p>
+    <w:p>
+      <w:pPr>
+        <w:pStyle w:val="Compact"/>
+        <w:numPr>
+          <w:ilvl w:val="0"/>
+          <w:numId w:val="1009"/>
+        </w:numPr>
+      </w:pPr>
+      <w:r>
+        <w:t xml:space="preserve">Back → returns to home</w:t>
       </w:r>
     </w:p>
     <w:bookmarkEnd w:id="28"/>
@@ -2453,7 +2516,14 @@
         </w:numPr>
       </w:pPr>
       <w:r>
-        <w:t xml:space="preserve">Album button available</w:t>
+        <w:rPr>
+          <w:b/>
+          <w:bCs/>
+        </w:rPr>
+        <w:t xml:space="preserve">Album button</w:t>
+      </w:r>
+      <w:r>
+        <w:t xml:space="preserve">: For ID Card / Passport modes (2-sided), opens a 2-image picker where user must select exactly 2 images (front and back). For Single Side mode, opens a single file picker.</w:t>
       </w:r>
     </w:p>
     <w:p>
@@ -2485,6 +2555,49 @@
       </w:r>
       <w:r>
         <w:t xml:space="preserve">: Scan/ID Card mode tabs hidden</w:t>
+      </w:r>
+    </w:p>
+    <w:p>
+      <w:pPr>
+        <w:pStyle w:val="Compact"/>
+        <w:numPr>
+          <w:ilvl w:val="0"/>
+          <w:numId w:val="1010"/>
+        </w:numPr>
+      </w:pPr>
+      <w:r>
+        <w:rPr>
+          <w:b/>
+          <w:bCs/>
+        </w:rPr>
+        <w:t xml:space="preserve">Back from capture (front captured, back not yet)</w:t>
+      </w:r>
+      <w:r>
+        <w:t xml:space="preserve">: Dialog:</w:t>
+      </w:r>
+      <w:r>
+        <w:t xml:space="preserve"> </w:t>
+      </w:r>
+      <w:r>
+        <w:t xml:space="preserve">“Discard photo?”</w:t>
+      </w:r>
+      <w:r>
+        <w:t xml:space="preserve"> </w:t>
+      </w:r>
+      <w:r>
+        <w:t xml:space="preserve">/</w:t>
+      </w:r>
+      <w:r>
+        <w:t xml:space="preserve"> </w:t>
+      </w:r>
+      <w:r>
+        <w:t xml:space="preserve">“Your captured front side photo will not be saved.”</w:t>
+      </w:r>
+      <w:r>
+        <w:t xml:space="preserve"> </w:t>
+      </w:r>
+      <w:r>
+        <w:t xml:space="preserve">/ [Cancel, Discard]</w:t>
       </w:r>
     </w:p>
     <w:bookmarkEnd w:id="29"/>
@@ -2668,13 +2781,13 @@
     </w:p>
     <w:bookmarkEnd w:id="32"/>
     <w:bookmarkEnd w:id="33"/>
-    <w:bookmarkStart w:id="37" w:name="pdf-to-image-include-long-image"/>
+    <w:bookmarkStart w:id="37" w:name="pdf-to-image"/>
     <w:p>
       <w:pPr>
         <w:pStyle w:val="Heading2"/>
       </w:pPr>
       <w:r>
-        <w:t xml:space="preserve">6. PDF to Image (Include Long Image)</w:t>
+        <w:t xml:space="preserve">6. PDF to Image</w:t>
       </w:r>
     </w:p>
     <w:p>
@@ -2682,28 +2795,7 @@
         <w:pStyle w:val="FirstParagraph"/>
       </w:pPr>
       <w:r>
-        <w:t xml:space="preserve">Two separate entry points:</w:t>
-      </w:r>
-      <w:r>
-        <w:t xml:space="preserve"> </w:t>
-      </w:r>
-      <w:r>
-        <w:t xml:space="preserve">“PDF to Image”</w:t>
-      </w:r>
-      <w:r>
-        <w:t xml:space="preserve"> </w:t>
-      </w:r>
-      <w:r>
-        <w:t xml:space="preserve">and</w:t>
-      </w:r>
-      <w:r>
-        <w:t xml:space="preserve"> </w:t>
-      </w:r>
-      <w:r>
-        <w:t xml:space="preserve">“PDF to Long Image”</w:t>
-      </w:r>
-      <w:r>
-        <w:t xml:space="preserve">.</w:t>
+        <w:t xml:space="preserve">Convert each page of a PDF into individual image files.</w:t>
       </w:r>
     </w:p>
     <w:p>
@@ -2737,13 +2829,19 @@
         <w:t xml:space="preserve"> </w:t>
       </w:r>
       <w:r>
-        <w:t xml:space="preserve">- Individual images: each page as separate JPEG/PNG</w:t>
-      </w:r>
-      <w:r>
-        <w:t xml:space="preserve"> </w:t>
-      </w:r>
-      <w:r>
-        <w:t xml:space="preserve">- Long image: all selected pages merged vertically</w:t>
+        <w:t xml:space="preserve">- Individual images: each page exported as a separate JPEG/PNG file</w:t>
+      </w:r>
+      <w:r>
+        <w:t xml:space="preserve"> </w:t>
+      </w:r>
+      <w:r>
+        <w:t xml:space="preserve">- User can select JPEG or PNG output format</w:t>
+      </w:r>
+      <w:r>
+        <w:t xml:space="preserve"> </w:t>
+      </w:r>
+      <w:r>
+        <w:t xml:space="preserve">- File Naming: “[OriginalName]_page[N].[ext]”</w:t>
       </w:r>
       <w:r>
         <w:t xml:space="preserve"> </w:t>
@@ -2940,7 +3038,7 @@
         <w:t xml:space="preserve"> </w:t>
       </w:r>
       <w:r>
-        <w:t xml:space="preserve">“Converted successfully!”</w:t>
+        <w:t xml:space="preserve">“Images Exported”</w:t>
       </w:r>
       <w:r>
         <w:t xml:space="preserve">, image count, format, save path</w:t>
@@ -2979,33 +3077,7 @@
         </w:numPr>
       </w:pPr>
       <w:r>
-        <w:rPr>
-          <w:b/>
-          <w:bCs/>
-        </w:rPr>
-        <w:t xml:space="preserve">Individual mode</w:t>
-      </w:r>
-      <w:r>
-        <w:t xml:space="preserve">: Open shows file list with thumbnails</w:t>
-      </w:r>
-    </w:p>
-    <w:p>
-      <w:pPr>
-        <w:pStyle w:val="Compact"/>
-        <w:numPr>
-          <w:ilvl w:val="0"/>
-          <w:numId w:val="1016"/>
-        </w:numPr>
-      </w:pPr>
-      <w:r>
-        <w:rPr>
-          <w:b/>
-          <w:bCs/>
-        </w:rPr>
-        <w:t xml:space="preserve">Long image mode</w:t>
-      </w:r>
-      <w:r>
-        <w:t xml:space="preserve">: Open shows full scrollable long image with Share button</w:t>
+        <w:t xml:space="preserve">Open shows file list with individual image thumbnails</w:t>
       </w:r>
     </w:p>
     <w:p>
@@ -3017,13 +3089,13 @@
     </w:p>
     <w:bookmarkEnd w:id="36"/>
     <w:bookmarkEnd w:id="37"/>
-    <w:bookmarkStart w:id="41" w:name="pdf-compress"/>
+    <w:bookmarkStart w:id="41" w:name="pdf-to-long-image"/>
     <w:p>
       <w:pPr>
         <w:pStyle w:val="Heading2"/>
       </w:pPr>
       <w:r>
-        <w:t xml:space="preserve">7. PDF Compress</w:t>
+        <w:t xml:space="preserve">7. PDF to Long Image</w:t>
       </w:r>
     </w:p>
     <w:p>
@@ -3031,7 +3103,7 @@
         <w:pStyle w:val="FirstParagraph"/>
       </w:pPr>
       <w:r>
-        <w:t xml:space="preserve">Reduce PDF file size while maintaining acceptable quality.</w:t>
+        <w:t xml:space="preserve">Convert selected pages of a PDF into a single vertically-stitched scrollable long image.</w:t>
       </w:r>
     </w:p>
     <w:p>
@@ -3065,19 +3137,25 @@
         <w:t xml:space="preserve"> </w:t>
       </w:r>
       <w:r>
-        <w:t xml:space="preserve">- Compressed PDF file</w:t>
-      </w:r>
-      <w:r>
-        <w:t xml:space="preserve"> </w:t>
-      </w:r>
-      <w:r>
-        <w:t xml:space="preserve">- File Naming: ’[OriginalName]_compressed.pdf’</w:t>
-      </w:r>
-      <w:r>
-        <w:t xml:space="preserve"> </w:t>
-      </w:r>
-      <w:r>
-        <w:t xml:space="preserve">- Output saved to: /storage/emulated/0/Documents/MXPlayer/PDF/</w:t>
+        <w:t xml:space="preserve">- Single long image: all selected pages merged vertically into one image file</w:t>
+      </w:r>
+      <w:r>
+        <w:t xml:space="preserve"> </w:t>
+      </w:r>
+      <w:r>
+        <w:t xml:space="preserve">- User can select JPEG or PNG output format</w:t>
+      </w:r>
+      <w:r>
+        <w:t xml:space="preserve"> </w:t>
+      </w:r>
+      <w:r>
+        <w:t xml:space="preserve">- File Naming: “[OriginalName]_longimage.[ext]”</w:t>
+      </w:r>
+      <w:r>
+        <w:t xml:space="preserve"> </w:t>
+      </w:r>
+      <w:r>
+        <w:t xml:space="preserve">- Output saved to: /storage/emulated/0/Pictures/MXPlayer/[OriginalName]/</w:t>
       </w:r>
     </w:p>
     <w:p>
@@ -3089,42 +3167,6 @@
           <w:b/>
           <w:bCs/>
         </w:rPr>
-        <w:t xml:space="preserve">Compression Levels:</w:t>
-      </w:r>
-      <w:r>
-        <w:t xml:space="preserve"> </w:t>
-      </w:r>
-      <w:r>
-        <w:t xml:space="preserve">- Small Size: Low quality, maximum compression (ratio ~0.25)</w:t>
-      </w:r>
-      <w:r>
-        <w:t xml:space="preserve"> </w:t>
-      </w:r>
-      <w:r>
-        <w:t xml:space="preserve">- Medium Size: Good quality, balanced (ratio ~0.45)</w:t>
-      </w:r>
-      <w:r>
-        <w:t xml:space="preserve"> </w:t>
-      </w:r>
-      <w:r>
-        <w:t xml:space="preserve">- Large Size: Best quality, minimal compression (ratio ~0.75)</w:t>
-      </w:r>
-      <w:r>
-        <w:t xml:space="preserve"> </w:t>
-      </w:r>
-      <w:r>
-        <w:t xml:space="preserve">- Default selection: Small Size</w:t>
-      </w:r>
-    </w:p>
-    <w:p>
-      <w:pPr>
-        <w:pStyle w:val="BodyText"/>
-      </w:pPr>
-      <w:r>
-        <w:rPr>
-          <w:b/>
-          <w:bCs/>
-        </w:rPr>
         <w:t xml:space="preserve">User Flow:</w:t>
       </w:r>
     </w:p>
@@ -3164,17 +3206,29 @@
         </w:numPr>
       </w:pPr>
       <w:r>
-        <w:t xml:space="preserve">Search bar + PDF file list with thumbnails, name, size, date</w:t>
+        <w:t xml:space="preserve">Search bar for filtering</w:t>
+      </w:r>
+    </w:p>
+    <w:p>
+      <w:pPr>
+        <w:pStyle w:val="Compact"/>
+        <w:numPr>
+          <w:ilvl w:val="0"/>
+          <w:numId w:val="1017"/>
+        </w:numPr>
+      </w:pPr>
+      <w:r>
+        <w:t xml:space="preserve">PDF file list with thumbnails, name, size, date</w:t>
       </w:r>
     </w:p>
     <w:bookmarkEnd w:id="38"/>
-    <w:bookmarkStart w:id="39" w:name="step-2-choose-level"/>
+    <w:bookmarkStart w:id="39" w:name="step-2-select-pages-1"/>
     <w:p>
       <w:pPr>
         <w:pStyle w:val="Heading3"/>
       </w:pPr>
       <w:r>
-        <w:t xml:space="preserve">Step 2: Choose Level</w:t>
+        <w:t xml:space="preserve">Step 2: Select Pages</w:t>
       </w:r>
     </w:p>
     <w:p>
@@ -3192,7 +3246,7 @@
         <w:t xml:space="preserve"> </w:t>
       </w:r>
       <w:r>
-        <w:t xml:space="preserve">“Compress PDF”</w:t>
+        <w:t xml:space="preserve">“Select Pages”</w:t>
       </w:r>
     </w:p>
     <w:p>
@@ -3204,7 +3258,7 @@
         </w:numPr>
       </w:pPr>
       <w:r>
-        <w:t xml:space="preserve">Three radio-style options with description</w:t>
+        <w:t xml:space="preserve">Page thumbnails in grid (3 columns) with real images</w:t>
       </w:r>
     </w:p>
     <w:p>
@@ -3216,23 +3270,53 @@
         </w:numPr>
       </w:pPr>
       <w:r>
-        <w:t xml:space="preserve">“Compress”</w:t>
-      </w:r>
-      <w:r>
-        <w:t xml:space="preserve"> </w:t>
-      </w:r>
-      <w:r>
-        <w:t xml:space="preserve">button at bottom</w:t>
+        <w:t xml:space="preserve">Select All checkbox in top bar</w:t>
+      </w:r>
+    </w:p>
+    <w:p>
+      <w:pPr>
+        <w:pStyle w:val="Compact"/>
+        <w:numPr>
+          <w:ilvl w:val="0"/>
+          <w:numId w:val="1018"/>
+        </w:numPr>
+      </w:pPr>
+      <w:r>
+        <w:t xml:space="preserve">Selected pages show order number badge</w:t>
+      </w:r>
+    </w:p>
+    <w:p>
+      <w:pPr>
+        <w:pStyle w:val="Compact"/>
+        <w:numPr>
+          <w:ilvl w:val="0"/>
+          <w:numId w:val="1018"/>
+        </w:numPr>
+      </w:pPr>
+      <w:r>
+        <w:t xml:space="preserve">Bottom bar: Format toggle (JPEG/PNG) +</w:t>
+      </w:r>
+      <w:r>
+        <w:t xml:space="preserve"> </w:t>
+      </w:r>
+      <w:r>
+        <w:t xml:space="preserve">“Convert (N)”</w:t>
+      </w:r>
+      <w:r>
+        <w:t xml:space="preserve"> </w:t>
+      </w:r>
+      <w:r>
+        <w:t xml:space="preserve">button</w:t>
       </w:r>
     </w:p>
     <w:bookmarkEnd w:id="39"/>
-    <w:bookmarkStart w:id="40" w:name="step-3-progress-done"/>
+    <w:bookmarkStart w:id="40" w:name="step-3-convert-done-1"/>
     <w:p>
       <w:pPr>
         <w:pStyle w:val="Heading3"/>
       </w:pPr>
       <w:r>
-        <w:t xml:space="preserve">Step 3: Progress → Done</w:t>
+        <w:t xml:space="preserve">Step 3: Convert → Done</w:t>
       </w:r>
     </w:p>
     <w:p>
@@ -3244,7 +3328,7 @@
         </w:numPr>
       </w:pPr>
       <w:r>
-        <w:t xml:space="preserve">Progress ring with ✓ on completion</w:t>
+        <w:t xml:space="preserve">Progress ring</w:t>
       </w:r>
     </w:p>
     <w:p>
@@ -3256,38 +3340,25 @@
         </w:numPr>
       </w:pPr>
       <w:r>
-        <w:rPr>
-          <w:b/>
-          <w:bCs/>
-        </w:rPr>
-        <w:t xml:space="preserve">If file already optimized</w:t>
-      </w:r>
-      <w:r>
-        <w:t xml:space="preserve"> </w:t>
-      </w:r>
-      <w:r>
-        <w:t xml:space="preserve">(reduction ≤ 1%): Green ✓,</w:t>
-      </w:r>
-      <w:r>
-        <w:t xml:space="preserve"> </w:t>
-      </w:r>
-      <w:r>
-        <w:t xml:space="preserve">“Already optimized”</w:t>
-      </w:r>
-      <w:r>
-        <w:t xml:space="preserve">, file info,</w:t>
-      </w:r>
-      <w:r>
-        <w:t xml:space="preserve"> </w:t>
-      </w:r>
-      <w:r>
-        <w:t xml:space="preserve">“Done”</w:t>
-      </w:r>
-      <w:r>
-        <w:t xml:space="preserve"> </w:t>
-      </w:r>
-      <w:r>
-        <w:t xml:space="preserve">button</w:t>
+        <w:t xml:space="preserve">Done page shows: ✓,</w:t>
+      </w:r>
+      <w:r>
+        <w:t xml:space="preserve"> </w:t>
+      </w:r>
+      <w:r>
+        <w:t xml:space="preserve">“Images Exported”</w:t>
+      </w:r>
+      <w:r>
+        <w:t xml:space="preserve">,</w:t>
+      </w:r>
+      <w:r>
+        <w:t xml:space="preserve"> </w:t>
+      </w:r>
+      <w:r>
+        <w:t xml:space="preserve">“1 long image”</w:t>
+      </w:r>
+      <w:r>
+        <w:t xml:space="preserve">, format, save path</w:t>
       </w:r>
     </w:p>
     <w:p>
@@ -3299,23 +3370,7 @@
         </w:numPr>
       </w:pPr>
       <w:r>
-        <w:rPr>
-          <w:b/>
-          <w:bCs/>
-        </w:rPr>
-        <w:t xml:space="preserve">If compressed</w:t>
-      </w:r>
-      <w:r>
-        <w:t xml:space="preserve">: ✓,</w:t>
-      </w:r>
-      <w:r>
-        <w:t xml:space="preserve"> </w:t>
-      </w:r>
-      <w:r>
-        <w:t xml:space="preserve">“Reduced by XX%”</w:t>
-      </w:r>
-      <w:r>
-        <w:t xml:space="preserve">, size comparison, file name, path, Share/Open buttons</w:t>
+        <w:t xml:space="preserve">Preview of the long image (scrollable thumbnail)</w:t>
       </w:r>
     </w:p>
     <w:p>
@@ -3327,7 +3382,31 @@
         </w:numPr>
       </w:pPr>
       <w:r>
-        <w:t xml:space="preserve">Open shows mock PDF page preview</w:t>
+        <w:t xml:space="preserve">Share and Open buttons</w:t>
+      </w:r>
+    </w:p>
+    <w:p>
+      <w:pPr>
+        <w:pStyle w:val="Compact"/>
+        <w:numPr>
+          <w:ilvl w:val="0"/>
+          <w:numId w:val="1019"/>
+        </w:numPr>
+      </w:pPr>
+      <w:r>
+        <w:t xml:space="preserve">Open shows full scrollable long image with Share button</w:t>
+      </w:r>
+    </w:p>
+    <w:p>
+      <w:pPr>
+        <w:pStyle w:val="Compact"/>
+        <w:numPr>
+          <w:ilvl w:val="0"/>
+          <w:numId w:val="1019"/>
+        </w:numPr>
+      </w:pPr>
+      <w:r>
+        <w:t xml:space="preserve">Back from long image preview returns to home</w:t>
       </w:r>
     </w:p>
     <w:p>
@@ -3339,13 +3418,13 @@
     </w:p>
     <w:bookmarkEnd w:id="40"/>
     <w:bookmarkEnd w:id="41"/>
-    <w:bookmarkStart w:id="45" w:name="pdf-merge"/>
+    <w:bookmarkStart w:id="45" w:name="pdf-compress"/>
     <w:p>
       <w:pPr>
         <w:pStyle w:val="Heading2"/>
       </w:pPr>
       <w:r>
-        <w:t xml:space="preserve">8. PDF Merge</w:t>
+        <w:t xml:space="preserve">8. PDF Compress</w:t>
       </w:r>
     </w:p>
     <w:p>
@@ -3353,7 +3432,7 @@
         <w:pStyle w:val="FirstParagraph"/>
       </w:pPr>
       <w:r>
-        <w:t xml:space="preserve">Combine multiple PDF files into one.</w:t>
+        <w:t xml:space="preserve">Reduce PDF file size while maintaining acceptable quality.</w:t>
       </w:r>
     </w:p>
     <w:p>
@@ -3371,13 +3450,35 @@
         <w:t xml:space="preserve"> </w:t>
       </w:r>
       <w:r>
-        <w:t xml:space="preserve">- Minimum: 2 PDF files</w:t>
-      </w:r>
-      <w:r>
-        <w:t xml:space="preserve"> </w:t>
-      </w:r>
-      <w:r>
-        <w:t xml:space="preserve">- Maximum: TBC</w:t>
+        <w:t xml:space="preserve">PDF file from device storage</w:t>
+      </w:r>
+      <w:r>
+        <w:t xml:space="preserve"> </w:t>
+      </w:r>
+      <w:r>
+        <w:rPr>
+          <w:b/>
+          <w:bCs/>
+        </w:rPr>
+        <w:t xml:space="preserve">Output:</w:t>
+      </w:r>
+      <w:r>
+        <w:t xml:space="preserve"> </w:t>
+      </w:r>
+      <w:r>
+        <w:t xml:space="preserve">- Compressed PDF file</w:t>
+      </w:r>
+      <w:r>
+        <w:t xml:space="preserve"> </w:t>
+      </w:r>
+      <w:r>
+        <w:t xml:space="preserve">- File Naming: ’[OriginalName]_compressed.pdf’</w:t>
+      </w:r>
+      <w:r>
+        <w:t xml:space="preserve"> </w:t>
+      </w:r>
+      <w:r>
+        <w:t xml:space="preserve">- Output saved to: /storage/emulated/0/Documents/MXPlayer/PDF/</w:t>
       </w:r>
     </w:p>
     <w:p>
@@ -3389,34 +3490,31 @@
           <w:b/>
           <w:bCs/>
         </w:rPr>
-        <w:t xml:space="preserve">Output:</w:t>
-      </w:r>
-      <w:r>
-        <w:t xml:space="preserve"> </w:t>
-      </w:r>
-      <w:r>
-        <w:t xml:space="preserve">- Single merged PDF</w:t>
-      </w:r>
-      <w:r>
-        <w:t xml:space="preserve"> </w:t>
-      </w:r>
-      <w:r>
-        <w:t xml:space="preserve">- File Naming: Default</w:t>
-      </w:r>
-      <w:r>
-        <w:t xml:space="preserve"> </w:t>
-      </w:r>
-      <w:r>
-        <w:t xml:space="preserve">‘Merged_[timestamp].pdf’</w:t>
-      </w:r>
-      <w:r>
-        <w:t xml:space="preserve">, user can rename</w:t>
-      </w:r>
-      <w:r>
-        <w:t xml:space="preserve"> </w:t>
-      </w:r>
-      <w:r>
-        <w:t xml:space="preserve">- Output saved to: /storage/emulated/0/Documents/MXPlayer/PDF/</w:t>
+        <w:t xml:space="preserve">Compression Levels:</w:t>
+      </w:r>
+      <w:r>
+        <w:t xml:space="preserve"> </w:t>
+      </w:r>
+      <w:r>
+        <w:t xml:space="preserve">- Small Size: Low quality, maximum compression (ratio ~0.25)</w:t>
+      </w:r>
+      <w:r>
+        <w:t xml:space="preserve"> </w:t>
+      </w:r>
+      <w:r>
+        <w:t xml:space="preserve">- Medium Size: Good quality, balanced (ratio ~0.45)</w:t>
+      </w:r>
+      <w:r>
+        <w:t xml:space="preserve"> </w:t>
+      </w:r>
+      <w:r>
+        <w:t xml:space="preserve">- Large Size: Best quality, minimal compression (ratio ~0.75)</w:t>
+      </w:r>
+      <w:r>
+        <w:t xml:space="preserve"> </w:t>
+      </w:r>
+      <w:r>
+        <w:t xml:space="preserve">- Default selection: Small Size</w:t>
       </w:r>
     </w:p>
     <w:p>
@@ -3431,13 +3529,13 @@
         <w:t xml:space="preserve">User Flow:</w:t>
       </w:r>
     </w:p>
-    <w:bookmarkStart w:id="42" w:name="step-1-select-files"/>
+    <w:bookmarkStart w:id="42" w:name="step-1-select-file-2"/>
     <w:p>
       <w:pPr>
         <w:pStyle w:val="Heading3"/>
       </w:pPr>
       <w:r>
-        <w:t xml:space="preserve">Step 1: Select Files</w:t>
+        <w:t xml:space="preserve">Step 1: Select File</w:t>
       </w:r>
     </w:p>
     <w:p>
@@ -3455,7 +3553,7 @@
         <w:t xml:space="preserve"> </w:t>
       </w:r>
       <w:r>
-        <w:t xml:space="preserve">“Select Files”</w:t>
+        <w:t xml:space="preserve">“Select File”</w:t>
       </w:r>
     </w:p>
     <w:p>
@@ -3467,47 +3565,17 @@
         </w:numPr>
       </w:pPr>
       <w:r>
-        <w:t xml:space="preserve">Search bar + PDF file list with styled thumbnails, name, size, date</w:t>
-      </w:r>
-    </w:p>
-    <w:p>
-      <w:pPr>
-        <w:pStyle w:val="Compact"/>
-        <w:numPr>
-          <w:ilvl w:val="0"/>
-          <w:numId w:val="1020"/>
-        </w:numPr>
-      </w:pPr>
-      <w:r>
-        <w:t xml:space="preserve">Checkbox selection, Select All in top bar</w:t>
-      </w:r>
-    </w:p>
-    <w:p>
-      <w:pPr>
-        <w:pStyle w:val="Compact"/>
-        <w:numPr>
-          <w:ilvl w:val="0"/>
-          <w:numId w:val="1020"/>
-        </w:numPr>
-      </w:pPr>
-      <w:r>
-        <w:t xml:space="preserve">“Next (N)”</w:t>
-      </w:r>
-      <w:r>
-        <w:t xml:space="preserve"> </w:t>
-      </w:r>
-      <w:r>
-        <w:t xml:space="preserve">button at bottom (enabled when ≥ 2 selected)</w:t>
+        <w:t xml:space="preserve">Search bar + PDF file list with thumbnails, name, size, date</w:t>
       </w:r>
     </w:p>
     <w:bookmarkEnd w:id="42"/>
-    <w:bookmarkStart w:id="43" w:name="step-2-reorder"/>
+    <w:bookmarkStart w:id="43" w:name="step-2-choose-level"/>
     <w:p>
       <w:pPr>
         <w:pStyle w:val="Heading3"/>
       </w:pPr>
       <w:r>
-        <w:t xml:space="preserve">Step 2: Reorder</w:t>
+        <w:t xml:space="preserve">Step 2: Choose Level</w:t>
       </w:r>
     </w:p>
     <w:p>
@@ -3525,7 +3593,7 @@
         <w:t xml:space="preserve"> </w:t>
       </w:r>
       <w:r>
-        <w:t xml:space="preserve">“Merge PDF”</w:t>
+        <w:t xml:space="preserve">“Compress PDF”</w:t>
       </w:r>
     </w:p>
     <w:p>
@@ -3537,13 +3605,7 @@
         </w:numPr>
       </w:pPr>
       <w:r>
-        <w:t xml:space="preserve">Hint:</w:t>
-      </w:r>
-      <w:r>
-        <w:t xml:space="preserve"> </w:t>
-      </w:r>
-      <w:r>
-        <w:t xml:space="preserve">“Drag to reorder”</w:t>
+        <w:t xml:space="preserve">Three radio-style options with description</w:t>
       </w:r>
     </w:p>
     <w:p>
@@ -3555,53 +3617,7 @@
         </w:numPr>
       </w:pPr>
       <w:r>
-        <w:t xml:space="preserve">File list with: red circle minus (−) delete button on left, thumbnail, file info, drag handle (☰) on right</w:t>
-      </w:r>
-    </w:p>
-    <w:p>
-      <w:pPr>
-        <w:pStyle w:val="Compact"/>
-        <w:numPr>
-          <w:ilvl w:val="0"/>
-          <w:numId w:val="1021"/>
-        </w:numPr>
-      </w:pPr>
-      <w:r>
-        <w:rPr>
-          <w:b/>
-          <w:bCs/>
-        </w:rPr>
-        <w:t xml:space="preserve">“+ Add PDF”</w:t>
-      </w:r>
-      <w:r>
-        <w:t xml:space="preserve"> </w:t>
-      </w:r>
-      <w:r>
-        <w:t xml:space="preserve">item at bottom of list (dashed border) to go back and add more files</w:t>
-      </w:r>
-    </w:p>
-    <w:p>
-      <w:pPr>
-        <w:pStyle w:val="Compact"/>
-        <w:numPr>
-          <w:ilvl w:val="0"/>
-          <w:numId w:val="1021"/>
-        </w:numPr>
-      </w:pPr>
-      <w:r>
-        <w:t xml:space="preserve">Deleting a file syncs the selection state</w:t>
-      </w:r>
-    </w:p>
-    <w:p>
-      <w:pPr>
-        <w:pStyle w:val="Compact"/>
-        <w:numPr>
-          <w:ilvl w:val="0"/>
-          <w:numId w:val="1021"/>
-        </w:numPr>
-      </w:pPr>
-      <w:r>
-        <w:t xml:space="preserve">“Merge (N)”</w:t>
+        <w:t xml:space="preserve">“Compress”</w:t>
       </w:r>
       <w:r>
         <w:t xml:space="preserve"> </w:t>
@@ -3610,26 +3626,14 @@
         <w:t xml:space="preserve">button at bottom</w:t>
       </w:r>
     </w:p>
-    <w:p>
-      <w:pPr>
-        <w:pStyle w:val="Compact"/>
-        <w:numPr>
-          <w:ilvl w:val="0"/>
-          <w:numId w:val="1021"/>
-        </w:numPr>
-      </w:pPr>
-      <w:r>
-        <w:t xml:space="preserve">Tap Merge → name the PDF in bottom sheet → progress</w:t>
-      </w:r>
-    </w:p>
     <w:bookmarkEnd w:id="43"/>
-    <w:bookmarkStart w:id="44" w:name="step-3-done"/>
+    <w:bookmarkStart w:id="44" w:name="step-3-progress-done"/>
     <w:p>
       <w:pPr>
         <w:pStyle w:val="Heading3"/>
       </w:pPr>
       <w:r>
-        <w:t xml:space="preserve">Step 3: Done</w:t>
+        <w:t xml:space="preserve">Step 3: Progress → Done</w:t>
       </w:r>
     </w:p>
     <w:p>
@@ -3641,16 +3645,7 @@
         </w:numPr>
       </w:pPr>
       <w:r>
-        <w:t xml:space="preserve">✓,</w:t>
-      </w:r>
-      <w:r>
-        <w:t xml:space="preserve"> </w:t>
-      </w:r>
-      <w:r>
-        <w:t xml:space="preserve">“Merged successfully!”</w:t>
-      </w:r>
-      <w:r>
-        <w:t xml:space="preserve">, PDF thumbnail, file name, path</w:t>
+        <w:t xml:space="preserve">Progress ring with ✓ on completion</w:t>
       </w:r>
     </w:p>
     <w:p>
@@ -3662,7 +3657,38 @@
         </w:numPr>
       </w:pPr>
       <w:r>
-        <w:t xml:space="preserve">Share/Open buttons</w:t>
+        <w:rPr>
+          <w:b/>
+          <w:bCs/>
+        </w:rPr>
+        <w:t xml:space="preserve">If file already optimized</w:t>
+      </w:r>
+      <w:r>
+        <w:t xml:space="preserve"> </w:t>
+      </w:r>
+      <w:r>
+        <w:t xml:space="preserve">(reduction ≤ 1%): Green ✓,</w:t>
+      </w:r>
+      <w:r>
+        <w:t xml:space="preserve"> </w:t>
+      </w:r>
+      <w:r>
+        <w:t xml:space="preserve">“Already optimized”</w:t>
+      </w:r>
+      <w:r>
+        <w:t xml:space="preserve">, file info,</w:t>
+      </w:r>
+      <w:r>
+        <w:t xml:space="preserve"> </w:t>
+      </w:r>
+      <w:r>
+        <w:t xml:space="preserve">“Done”</w:t>
+      </w:r>
+      <w:r>
+        <w:t xml:space="preserve"> </w:t>
+      </w:r>
+      <w:r>
+        <w:t xml:space="preserve">button</w:t>
       </w:r>
     </w:p>
     <w:p>
@@ -3674,7 +3700,35 @@
         </w:numPr>
       </w:pPr>
       <w:r>
-        <w:t xml:space="preserve">Open shows multi-page mock PDF preview</w:t>
+        <w:rPr>
+          <w:b/>
+          <w:bCs/>
+        </w:rPr>
+        <w:t xml:space="preserve">If compressed</w:t>
+      </w:r>
+      <w:r>
+        <w:t xml:space="preserve">: ✓,</w:t>
+      </w:r>
+      <w:r>
+        <w:t xml:space="preserve"> </w:t>
+      </w:r>
+      <w:r>
+        <w:t xml:space="preserve">“Reduced by XX%”</w:t>
+      </w:r>
+      <w:r>
+        <w:t xml:space="preserve">, size comparison, file name, path, Share/Open buttons</w:t>
+      </w:r>
+    </w:p>
+    <w:p>
+      <w:pPr>
+        <w:pStyle w:val="Compact"/>
+        <w:numPr>
+          <w:ilvl w:val="0"/>
+          <w:numId w:val="1022"/>
+        </w:numPr>
+      </w:pPr>
+      <w:r>
+        <w:t xml:space="preserve">Open shows mock PDF page preview</w:t>
       </w:r>
     </w:p>
     <w:p>
@@ -3686,13 +3740,13 @@
     </w:p>
     <w:bookmarkEnd w:id="44"/>
     <w:bookmarkEnd w:id="45"/>
-    <w:bookmarkStart w:id="49" w:name="pdf-extract-formerly-split"/>
+    <w:bookmarkStart w:id="49" w:name="pdf-merge"/>
     <w:p>
       <w:pPr>
         <w:pStyle w:val="Heading2"/>
       </w:pPr>
       <w:r>
-        <w:t xml:space="preserve">9. PDF Extract (formerly Split)</w:t>
+        <w:t xml:space="preserve">9. PDF Merge</w:t>
       </w:r>
     </w:p>
     <w:p>
@@ -3700,7 +3754,7 @@
         <w:pStyle w:val="FirstParagraph"/>
       </w:pPr>
       <w:r>
-        <w:t xml:space="preserve">Extract specific pages from a PDF file to create a new PDF document.</w:t>
+        <w:t xml:space="preserve">Combine multiple PDF files into one.</w:t>
       </w:r>
     </w:p>
     <w:p>
@@ -3718,11 +3772,19 @@
         <w:t xml:space="preserve"> </w:t>
       </w:r>
       <w:r>
-        <w:t xml:space="preserve">Single PDF file</w:t>
-      </w:r>
-      <w:r>
-        <w:t xml:space="preserve"> </w:t>
-      </w:r>
+        <w:t xml:space="preserve">- Minimum: 2 PDF files</w:t>
+      </w:r>
+      <w:r>
+        <w:t xml:space="preserve"> </w:t>
+      </w:r>
+      <w:r>
+        <w:t xml:space="preserve">- Maximum: TBC</w:t>
+      </w:r>
+    </w:p>
+    <w:p>
+      <w:pPr>
+        <w:pStyle w:val="BodyText"/>
+      </w:pPr>
       <w:r>
         <w:rPr>
           <w:b/>
@@ -3734,13 +3796,22 @@
         <w:t xml:space="preserve"> </w:t>
       </w:r>
       <w:r>
-        <w:t xml:space="preserve">- Single PDF with selected pages (in original page order)</w:t>
-      </w:r>
-      <w:r>
-        <w:t xml:space="preserve"> </w:t>
-      </w:r>
-      <w:r>
-        <w:t xml:space="preserve">- File Naming: ’[OriginalName]_p[pages].pdf’</w:t>
+        <w:t xml:space="preserve">- Single merged PDF</w:t>
+      </w:r>
+      <w:r>
+        <w:t xml:space="preserve"> </w:t>
+      </w:r>
+      <w:r>
+        <w:t xml:space="preserve">- File Naming: Default</w:t>
+      </w:r>
+      <w:r>
+        <w:t xml:space="preserve"> </w:t>
+      </w:r>
+      <w:r>
+        <w:t xml:space="preserve">‘Merged_[timestamp].pdf’</w:t>
+      </w:r>
+      <w:r>
+        <w:t xml:space="preserve">, user can rename</w:t>
       </w:r>
       <w:r>
         <w:t xml:space="preserve"> </w:t>
@@ -3761,13 +3832,13 @@
         <w:t xml:space="preserve">User Flow:</w:t>
       </w:r>
     </w:p>
-    <w:bookmarkStart w:id="46" w:name="step-1-select-file-2"/>
+    <w:bookmarkStart w:id="46" w:name="step-1-select-files"/>
     <w:p>
       <w:pPr>
         <w:pStyle w:val="Heading3"/>
       </w:pPr>
       <w:r>
-        <w:t xml:space="preserve">Step 1: Select File</w:t>
+        <w:t xml:space="preserve">Step 1: Select Files</w:t>
       </w:r>
     </w:p>
     <w:p>
@@ -3785,7 +3856,7 @@
         <w:t xml:space="preserve"> </w:t>
       </w:r>
       <w:r>
-        <w:t xml:space="preserve">“Select File”</w:t>
+        <w:t xml:space="preserve">“Select Files”</w:t>
       </w:r>
     </w:p>
     <w:p>
@@ -3797,17 +3868,47 @@
         </w:numPr>
       </w:pPr>
       <w:r>
-        <w:t xml:space="preserve">Search bar + PDF file list with thumbnails, name, size, date, page count</w:t>
+        <w:t xml:space="preserve">Search bar + PDF file list with styled thumbnails, name, size, date</w:t>
+      </w:r>
+    </w:p>
+    <w:p>
+      <w:pPr>
+        <w:pStyle w:val="Compact"/>
+        <w:numPr>
+          <w:ilvl w:val="0"/>
+          <w:numId w:val="1023"/>
+        </w:numPr>
+      </w:pPr>
+      <w:r>
+        <w:t xml:space="preserve">Checkbox selection, Select All in top bar</w:t>
+      </w:r>
+    </w:p>
+    <w:p>
+      <w:pPr>
+        <w:pStyle w:val="Compact"/>
+        <w:numPr>
+          <w:ilvl w:val="0"/>
+          <w:numId w:val="1023"/>
+        </w:numPr>
+      </w:pPr>
+      <w:r>
+        <w:t xml:space="preserve">“Next (N)”</w:t>
+      </w:r>
+      <w:r>
+        <w:t xml:space="preserve"> </w:t>
+      </w:r>
+      <w:r>
+        <w:t xml:space="preserve">button at bottom (enabled when ≥ 2 selected)</w:t>
       </w:r>
     </w:p>
     <w:bookmarkEnd w:id="46"/>
-    <w:bookmarkStart w:id="47" w:name="step-2-select-pages-1"/>
+    <w:bookmarkStart w:id="47" w:name="step-2-reorder"/>
     <w:p>
       <w:pPr>
         <w:pStyle w:val="Heading3"/>
       </w:pPr>
       <w:r>
-        <w:t xml:space="preserve">Step 2: Select Pages</w:t>
+        <w:t xml:space="preserve">Step 2: Reorder</w:t>
       </w:r>
     </w:p>
     <w:p>
@@ -3825,7 +3926,7 @@
         <w:t xml:space="preserve"> </w:t>
       </w:r>
       <w:r>
-        <w:t xml:space="preserve">“Select Pages”</w:t>
+        <w:t xml:space="preserve">“Merge PDF”</w:t>
       </w:r>
     </w:p>
     <w:p>
@@ -3837,7 +3938,13 @@
         </w:numPr>
       </w:pPr>
       <w:r>
-        <w:t xml:space="preserve">Page thumbnails in grid (3 columns) with real images</w:t>
+        <w:t xml:space="preserve">Hint:</w:t>
+      </w:r>
+      <w:r>
+        <w:t xml:space="preserve"> </w:t>
+      </w:r>
+      <w:r>
+        <w:t xml:space="preserve">“Drag to reorder”</w:t>
       </w:r>
     </w:p>
     <w:p>
@@ -3849,7 +3956,7 @@
         </w:numPr>
       </w:pPr>
       <w:r>
-        <w:t xml:space="preserve">Selected pages show ✓ checkmark (no order number — pages are always in original order)</w:t>
+        <w:t xml:space="preserve">File list with: red circle minus (−) delete button on left, thumbnail, file info, drag handle (☰) on right</w:t>
       </w:r>
     </w:p>
     <w:p>
@@ -3861,7 +3968,17 @@
         </w:numPr>
       </w:pPr>
       <w:r>
-        <w:t xml:space="preserve">Select All checkbox in top bar</w:t>
+        <w:rPr>
+          <w:b/>
+          <w:bCs/>
+        </w:rPr>
+        <w:t xml:space="preserve">“+ Add PDF”</w:t>
+      </w:r>
+      <w:r>
+        <w:t xml:space="preserve"> </w:t>
+      </w:r>
+      <w:r>
+        <w:t xml:space="preserve">item at bottom of list (dashed border) to go back and add more files</w:t>
       </w:r>
     </w:p>
     <w:p>
@@ -3873,7 +3990,7 @@
         </w:numPr>
       </w:pPr>
       <w:r>
-        <w:t xml:space="preserve">Page number shown at bottom of each thumbnail</w:t>
+        <w:t xml:space="preserve">Deleting a file syncs the selection state</w:t>
       </w:r>
     </w:p>
     <w:p>
@@ -3885,7 +4002,7 @@
         </w:numPr>
       </w:pPr>
       <w:r>
-        <w:t xml:space="preserve">“Extract (N pages)”</w:t>
+        <w:t xml:space="preserve">“Merge (N)”</w:t>
       </w:r>
       <w:r>
         <w:t xml:space="preserve"> </w:t>
@@ -3894,14 +4011,26 @@
         <w:t xml:space="preserve">button at bottom</w:t>
       </w:r>
     </w:p>
+    <w:p>
+      <w:pPr>
+        <w:pStyle w:val="Compact"/>
+        <w:numPr>
+          <w:ilvl w:val="0"/>
+          <w:numId w:val="1024"/>
+        </w:numPr>
+      </w:pPr>
+      <w:r>
+        <w:t xml:space="preserve">Tap Merge → name the PDF in bottom sheet → progress</w:t>
+      </w:r>
+    </w:p>
     <w:bookmarkEnd w:id="47"/>
-    <w:bookmarkStart w:id="48" w:name="step-3-progress-done-1"/>
+    <w:bookmarkStart w:id="48" w:name="step-3-done"/>
     <w:p>
       <w:pPr>
         <w:pStyle w:val="Heading3"/>
       </w:pPr>
       <w:r>
-        <w:t xml:space="preserve">Step 3: Progress → Done</w:t>
+        <w:t xml:space="preserve">Step 3: Done</w:t>
       </w:r>
     </w:p>
     <w:p>
@@ -3913,7 +4042,16 @@
         </w:numPr>
       </w:pPr>
       <w:r>
-        <w:t xml:space="preserve">Progress ring</w:t>
+        <w:t xml:space="preserve">✓,</w:t>
+      </w:r>
+      <w:r>
+        <w:t xml:space="preserve"> </w:t>
+      </w:r>
+      <w:r>
+        <w:t xml:space="preserve">“Merged successfully!”</w:t>
+      </w:r>
+      <w:r>
+        <w:t xml:space="preserve">, PDF thumbnail, file name, path</w:t>
       </w:r>
     </w:p>
     <w:p>
@@ -3925,16 +4063,7 @@
         </w:numPr>
       </w:pPr>
       <w:r>
-        <w:t xml:space="preserve">Done page: ✓,</w:t>
-      </w:r>
-      <w:r>
-        <w:t xml:space="preserve"> </w:t>
-      </w:r>
-      <w:r>
-        <w:t xml:space="preserve">“Extracted successfully!”</w:t>
-      </w:r>
-      <w:r>
-        <w:t xml:space="preserve">, PDF thumbnail, file name, path</w:t>
+        <w:t xml:space="preserve">Share/Open buttons</w:t>
       </w:r>
     </w:p>
     <w:p>
@@ -3946,19 +4075,7 @@
         </w:numPr>
       </w:pPr>
       <w:r>
-        <w:t xml:space="preserve">Share/Open buttons</w:t>
-      </w:r>
-    </w:p>
-    <w:p>
-      <w:pPr>
-        <w:pStyle w:val="Compact"/>
-        <w:numPr>
-          <w:ilvl w:val="0"/>
-          <w:numId w:val="1025"/>
-        </w:numPr>
-      </w:pPr>
-      <w:r>
-        <w:t xml:space="preserve">Open shows selected pages as scrollable image preview</w:t>
+        <w:t xml:space="preserve">Open shows multi-page mock PDF preview</w:t>
       </w:r>
     </w:p>
     <w:p>
@@ -3970,13 +4087,13 @@
     </w:p>
     <w:bookmarkEnd w:id="48"/>
     <w:bookmarkEnd w:id="49"/>
-    <w:bookmarkStart w:id="50" w:name="processing-cancel-operation"/>
+    <w:bookmarkStart w:id="53" w:name="pdf-extract-formerly-split"/>
     <w:p>
       <w:pPr>
         <w:pStyle w:val="Heading2"/>
       </w:pPr>
       <w:r>
-        <w:t xml:space="preserve">10. Processing Cancel Operation</w:t>
+        <w:t xml:space="preserve">10. PDF Extract (formerly Split)</w:t>
       </w:r>
     </w:p>
     <w:p>
@@ -3984,17 +4101,7 @@
         <w:pStyle w:val="FirstParagraph"/>
       </w:pPr>
       <w:r>
-        <w:rPr>
-          <w:b/>
-          <w:bCs/>
-        </w:rPr>
-        <w:t xml:space="preserve">Applies to:</w:t>
-      </w:r>
-      <w:r>
-        <w:t xml:space="preserve"> </w:t>
-      </w:r>
-      <w:r>
-        <w:t xml:space="preserve">All PDF processing features</w:t>
+        <w:t xml:space="preserve">Extract specific pages from a PDF file to create a new PDF document.</w:t>
       </w:r>
     </w:p>
     <w:p>
@@ -4006,19 +4113,288 @@
           <w:b/>
           <w:bCs/>
         </w:rPr>
-        <w:t xml:space="preserve">Behavior:</w:t>
-      </w:r>
-      <w:r>
-        <w:t xml:space="preserve"> </w:t>
-      </w:r>
-      <w:r>
-        <w:t xml:space="preserve">If the user presses the back button/gesture during processing or editing:</w:t>
-      </w:r>
-      <w:r>
-        <w:t xml:space="preserve"> </w:t>
-      </w:r>
-      <w:r>
-        <w:t xml:space="preserve">- Confirmation dialog appears</w:t>
+        <w:t xml:space="preserve">Input:</w:t>
+      </w:r>
+      <w:r>
+        <w:t xml:space="preserve"> </w:t>
+      </w:r>
+      <w:r>
+        <w:t xml:space="preserve">Single PDF file</w:t>
+      </w:r>
+      <w:r>
+        <w:t xml:space="preserve"> </w:t>
+      </w:r>
+      <w:r>
+        <w:rPr>
+          <w:b/>
+          <w:bCs/>
+        </w:rPr>
+        <w:t xml:space="preserve">Output:</w:t>
+      </w:r>
+      <w:r>
+        <w:t xml:space="preserve"> </w:t>
+      </w:r>
+      <w:r>
+        <w:t xml:space="preserve">- Single PDF with selected pages (in original page order)</w:t>
+      </w:r>
+      <w:r>
+        <w:t xml:space="preserve"> </w:t>
+      </w:r>
+      <w:r>
+        <w:t xml:space="preserve">- File Naming: ’[OriginalName]_extracted.pdf’</w:t>
+      </w:r>
+      <w:r>
+        <w:t xml:space="preserve"> </w:t>
+      </w:r>
+      <w:r>
+        <w:t xml:space="preserve">- Output saved to: /storage/emulated/0/Documents/MXPlayer/PDF/</w:t>
+      </w:r>
+    </w:p>
+    <w:p>
+      <w:pPr>
+        <w:pStyle w:val="BodyText"/>
+      </w:pPr>
+      <w:r>
+        <w:rPr>
+          <w:b/>
+          <w:bCs/>
+        </w:rPr>
+        <w:t xml:space="preserve">User Flow:</w:t>
+      </w:r>
+    </w:p>
+    <w:bookmarkStart w:id="50" w:name="step-1-select-file-3"/>
+    <w:p>
+      <w:pPr>
+        <w:pStyle w:val="Heading3"/>
+      </w:pPr>
+      <w:r>
+        <w:t xml:space="preserve">Step 1: Select File</w:t>
+      </w:r>
+    </w:p>
+    <w:p>
+      <w:pPr>
+        <w:pStyle w:val="Compact"/>
+        <w:numPr>
+          <w:ilvl w:val="0"/>
+          <w:numId w:val="1026"/>
+        </w:numPr>
+      </w:pPr>
+      <w:r>
+        <w:t xml:space="preserve">Title:</w:t>
+      </w:r>
+      <w:r>
+        <w:t xml:space="preserve"> </w:t>
+      </w:r>
+      <w:r>
+        <w:t xml:space="preserve">“Select File”</w:t>
+      </w:r>
+    </w:p>
+    <w:p>
+      <w:pPr>
+        <w:pStyle w:val="Compact"/>
+        <w:numPr>
+          <w:ilvl w:val="0"/>
+          <w:numId w:val="1026"/>
+        </w:numPr>
+      </w:pPr>
+      <w:r>
+        <w:t xml:space="preserve">Search bar + PDF file list with thumbnails, name, size, date, page count</w:t>
+      </w:r>
+    </w:p>
+    <w:bookmarkEnd w:id="50"/>
+    <w:bookmarkStart w:id="51" w:name="step-2-select-pages-2"/>
+    <w:p>
+      <w:pPr>
+        <w:pStyle w:val="Heading3"/>
+      </w:pPr>
+      <w:r>
+        <w:t xml:space="preserve">Step 2: Select Pages</w:t>
+      </w:r>
+    </w:p>
+    <w:p>
+      <w:pPr>
+        <w:pStyle w:val="Compact"/>
+        <w:numPr>
+          <w:ilvl w:val="0"/>
+          <w:numId w:val="1027"/>
+        </w:numPr>
+      </w:pPr>
+      <w:r>
+        <w:t xml:space="preserve">Title:</w:t>
+      </w:r>
+      <w:r>
+        <w:t xml:space="preserve"> </w:t>
+      </w:r>
+      <w:r>
+        <w:t xml:space="preserve">“Select Pages”</w:t>
+      </w:r>
+    </w:p>
+    <w:p>
+      <w:pPr>
+        <w:pStyle w:val="Compact"/>
+        <w:numPr>
+          <w:ilvl w:val="0"/>
+          <w:numId w:val="1027"/>
+        </w:numPr>
+      </w:pPr>
+      <w:r>
+        <w:t xml:space="preserve">Page thumbnails in grid (3 columns) with real images</w:t>
+      </w:r>
+    </w:p>
+    <w:p>
+      <w:pPr>
+        <w:pStyle w:val="Compact"/>
+        <w:numPr>
+          <w:ilvl w:val="0"/>
+          <w:numId w:val="1027"/>
+        </w:numPr>
+      </w:pPr>
+      <w:r>
+        <w:t xml:space="preserve">Selected pages show ✓ checkmark (no order number — pages are always in original order)</w:t>
+      </w:r>
+    </w:p>
+    <w:p>
+      <w:pPr>
+        <w:pStyle w:val="Compact"/>
+        <w:numPr>
+          <w:ilvl w:val="0"/>
+          <w:numId w:val="1027"/>
+        </w:numPr>
+      </w:pPr>
+      <w:r>
+        <w:t xml:space="preserve">Select All checkbox in top bar</w:t>
+      </w:r>
+    </w:p>
+    <w:p>
+      <w:pPr>
+        <w:pStyle w:val="Compact"/>
+        <w:numPr>
+          <w:ilvl w:val="0"/>
+          <w:numId w:val="1027"/>
+        </w:numPr>
+      </w:pPr>
+      <w:r>
+        <w:t xml:space="preserve">Page number shown at bottom of each thumbnail</w:t>
+      </w:r>
+    </w:p>
+    <w:p>
+      <w:pPr>
+        <w:pStyle w:val="Compact"/>
+        <w:numPr>
+          <w:ilvl w:val="0"/>
+          <w:numId w:val="1027"/>
+        </w:numPr>
+      </w:pPr>
+      <w:r>
+        <w:t xml:space="preserve">“Extract (N pages)”</w:t>
+      </w:r>
+      <w:r>
+        <w:t xml:space="preserve"> </w:t>
+      </w:r>
+      <w:r>
+        <w:t xml:space="preserve">button at bottom</w:t>
+      </w:r>
+    </w:p>
+    <w:bookmarkEnd w:id="51"/>
+    <w:bookmarkStart w:id="52" w:name="step-3-progress-done-1"/>
+    <w:p>
+      <w:pPr>
+        <w:pStyle w:val="Heading3"/>
+      </w:pPr>
+      <w:r>
+        <w:t xml:space="preserve">Step 3: Progress → Done</w:t>
+      </w:r>
+    </w:p>
+    <w:p>
+      <w:pPr>
+        <w:pStyle w:val="Compact"/>
+        <w:numPr>
+          <w:ilvl w:val="0"/>
+          <w:numId w:val="1028"/>
+        </w:numPr>
+      </w:pPr>
+      <w:r>
+        <w:t xml:space="preserve">Progress ring</w:t>
+      </w:r>
+    </w:p>
+    <w:p>
+      <w:pPr>
+        <w:pStyle w:val="Compact"/>
+        <w:numPr>
+          <w:ilvl w:val="0"/>
+          <w:numId w:val="1028"/>
+        </w:numPr>
+      </w:pPr>
+      <w:r>
+        <w:t xml:space="preserve">Done page: ✓,</w:t>
+      </w:r>
+      <w:r>
+        <w:t xml:space="preserve"> </w:t>
+      </w:r>
+      <w:r>
+        <w:t xml:space="preserve">“Extracted successfully!”</w:t>
+      </w:r>
+      <w:r>
+        <w:t xml:space="preserve">, PDF thumbnail, file name, path</w:t>
+      </w:r>
+    </w:p>
+    <w:p>
+      <w:pPr>
+        <w:pStyle w:val="Compact"/>
+        <w:numPr>
+          <w:ilvl w:val="0"/>
+          <w:numId w:val="1028"/>
+        </w:numPr>
+      </w:pPr>
+      <w:r>
+        <w:t xml:space="preserve">Share/Open buttons</w:t>
+      </w:r>
+    </w:p>
+    <w:p>
+      <w:pPr>
+        <w:pStyle w:val="Compact"/>
+        <w:numPr>
+          <w:ilvl w:val="0"/>
+          <w:numId w:val="1028"/>
+        </w:numPr>
+      </w:pPr>
+      <w:r>
+        <w:t xml:space="preserve">Open shows selected pages as scrollable image preview</w:t>
+      </w:r>
+    </w:p>
+    <w:p>
+      <w:r>
+        <w:pict>
+          <v:rect style="width:0;height:1.5pt" o:hralign="center" o:hrstd="t" o:hr="t"/>
+        </w:pict>
+      </w:r>
+    </w:p>
+    <w:bookmarkEnd w:id="52"/>
+    <w:bookmarkEnd w:id="53"/>
+    <w:bookmarkStart w:id="62" w:name="processing-cancel-operation"/>
+    <w:p>
+      <w:pPr>
+        <w:pStyle w:val="Heading2"/>
+      </w:pPr>
+      <w:r>
+        <w:t xml:space="preserve">11. Processing Cancel Operation</w:t>
+      </w:r>
+    </w:p>
+    <w:p>
+      <w:pPr>
+        <w:pStyle w:val="FirstParagraph"/>
+      </w:pPr>
+      <w:r>
+        <w:t xml:space="preserve">When the user presses the back button or gesture, a confirmation dialog appears if there is unsaved progress. If there is nothing to lose, the user navigates back directly without a dialog.</w:t>
+      </w:r>
+    </w:p>
+    <w:bookmarkStart w:id="54" w:name="image-to-pdf-scan-to-pdf"/>
+    <w:p>
+      <w:pPr>
+        <w:pStyle w:val="Heading3"/>
+      </w:pPr>
+      <w:r>
+        <w:t xml:space="preserve">Image to PDF / Scan to PDF</w:t>
       </w:r>
     </w:p>
     <w:tbl>
@@ -4029,11 +4405,8 @@
         <w:tblLook w:firstRow="1" w:lastRow="0" w:firstColumn="0" w:lastColumn="0" w:noHBand="0" w:noVBand="0" w:val="0020"/>
       </w:tblPr>
       <w:tblGrid>
-        <w:gridCol w:w="950"/>
-        <w:gridCol w:w="1425"/>
-        <w:gridCol w:w="2059"/>
-        <w:gridCol w:w="2534"/>
-        <w:gridCol w:w="950"/>
+        <w:gridCol w:w="3655"/>
+        <w:gridCol w:w="4264"/>
       </w:tblGrid>
       <w:tr>
         <w:trPr>
@@ -4046,7 +4419,7 @@
               <w:pStyle w:val="Compact"/>
             </w:pPr>
             <w:r>
-              <w:t xml:space="preserve">Area</w:t>
+              <w:t xml:space="preserve">User is on</w:t>
             </w:r>
           </w:p>
         </w:tc>
@@ -4057,40 +4430,7 @@
               <w:pStyle w:val="Compact"/>
             </w:pPr>
             <w:r>
-              <w:t xml:space="preserve">Feature</w:t>
-            </w:r>
-          </w:p>
-        </w:tc>
-        <w:tc>
-          <w:tcPr/>
-          <w:p>
-            <w:pPr>
-              <w:pStyle w:val="Compact"/>
-            </w:pPr>
-            <w:r>
-              <w:t xml:space="preserve">Dialog Title</w:t>
-            </w:r>
-          </w:p>
-        </w:tc>
-        <w:tc>
-          <w:tcPr/>
-          <w:p>
-            <w:pPr>
-              <w:pStyle w:val="Compact"/>
-            </w:pPr>
-            <w:r>
-              <w:t xml:space="preserve">Dialog Content</w:t>
-            </w:r>
-          </w:p>
-        </w:tc>
-        <w:tc>
-          <w:tcPr/>
-          <w:p>
-            <w:pPr>
-              <w:pStyle w:val="Compact"/>
-            </w:pPr>
-            <w:r>
-              <w:t xml:space="preserve">CTAs</w:t>
+              <w:t xml:space="preserve">Back behavior</w:t>
             </w:r>
           </w:p>
         </w:tc>
@@ -4103,7 +4443,7 @@
               <w:pStyle w:val="Compact"/>
             </w:pPr>
             <w:r>
-              <w:t xml:space="preserve">PDF Generate/Convert</w:t>
+              <w:t xml:space="preserve">Image Picker</w:t>
             </w:r>
           </w:p>
         </w:tc>
@@ -4114,40 +4454,7 @@
               <w:pStyle w:val="Compact"/>
             </w:pPr>
             <w:r>
-              <w:t xml:space="preserve">Image to PDF, PDF to Image, Scan to PDF, ID Card Scan</w:t>
-            </w:r>
-          </w:p>
-        </w:tc>
-        <w:tc>
-          <w:tcPr/>
-          <w:p>
-            <w:pPr>
-              <w:pStyle w:val="Compact"/>
-            </w:pPr>
-            <w:r>
-              <w:t xml:space="preserve">Quit?</w:t>
-            </w:r>
-          </w:p>
-        </w:tc>
-        <w:tc>
-          <w:tcPr/>
-          <w:p>
-            <w:pPr>
-              <w:pStyle w:val="Compact"/>
-            </w:pPr>
-            <w:r>
-              <w:t xml:space="preserve">Your current progress will be lost. Are you sure you want to quit?</w:t>
-            </w:r>
-          </w:p>
-        </w:tc>
-        <w:tc>
-          <w:tcPr/>
-          <w:p>
-            <w:pPr>
-              <w:pStyle w:val="Compact"/>
-            </w:pPr>
-            <w:r>
-              <w:t xml:space="preserve">[Cancel, Quit]</w:t>
+              <w:t xml:space="preserve">Direct back, no dialog</w:t>
             </w:r>
           </w:p>
         </w:tc>
@@ -4160,7 +4467,7 @@
               <w:pStyle w:val="Compact"/>
             </w:pPr>
             <w:r>
-              <w:t xml:space="preserve">Compress</w:t>
+              <w:t xml:space="preserve">Editor (has edits)</w:t>
             </w:r>
           </w:p>
         </w:tc>
@@ -4171,40 +4478,31 @@
               <w:pStyle w:val="Compact"/>
             </w:pPr>
             <w:r>
-              <w:t xml:space="preserve">Compress PDF</w:t>
-            </w:r>
-          </w:p>
-        </w:tc>
-        <w:tc>
-          <w:tcPr/>
-          <w:p>
-            <w:pPr>
-              <w:pStyle w:val="Compact"/>
-            </w:pPr>
-            <w:r>
-              <w:t xml:space="preserve">Quit compressing?</w:t>
-            </w:r>
-          </w:p>
-        </w:tc>
-        <w:tc>
-          <w:tcPr/>
-          <w:p>
-            <w:pPr>
-              <w:pStyle w:val="Compact"/>
-            </w:pPr>
-            <w:r>
-              <w:t xml:space="preserve">Are you sure you want to quit and discard the changes?</w:t>
-            </w:r>
-          </w:p>
-        </w:tc>
-        <w:tc>
-          <w:tcPr/>
-          <w:p>
-            <w:pPr>
-              <w:pStyle w:val="Compact"/>
-            </w:pPr>
-            <w:r>
-              <w:t xml:space="preserve">[Cancel, Quit]</w:t>
+              <w:t xml:space="preserve">Dialog:</w:t>
+            </w:r>
+            <w:r>
+              <w:t xml:space="preserve"> </w:t>
+            </w:r>
+            <w:r>
+              <w:t xml:space="preserve">“Quit?”</w:t>
+            </w:r>
+            <w:r>
+              <w:t xml:space="preserve"> </w:t>
+            </w:r>
+            <w:r>
+              <w:t xml:space="preserve">/</w:t>
+            </w:r>
+            <w:r>
+              <w:t xml:space="preserve"> </w:t>
+            </w:r>
+            <w:r>
+              <w:t xml:space="preserve">“Your current progress will be lost.”</w:t>
+            </w:r>
+            <w:r>
+              <w:t xml:space="preserve"> </w:t>
+            </w:r>
+            <w:r>
+              <w:t xml:space="preserve">/ [Cancel, Quit]</w:t>
             </w:r>
           </w:p>
         </w:tc>
@@ -4217,7 +4515,7 @@
               <w:pStyle w:val="Compact"/>
             </w:pPr>
             <w:r>
-              <w:t xml:space="preserve">Merge</w:t>
+              <w:t xml:space="preserve">Preview page</w:t>
             </w:r>
           </w:p>
         </w:tc>
@@ -4228,40 +4526,7 @@
               <w:pStyle w:val="Compact"/>
             </w:pPr>
             <w:r>
-              <w:t xml:space="preserve">Merge PDF</w:t>
-            </w:r>
-          </w:p>
-        </w:tc>
-        <w:tc>
-          <w:tcPr/>
-          <w:p>
-            <w:pPr>
-              <w:pStyle w:val="Compact"/>
-            </w:pPr>
-            <w:r>
-              <w:t xml:space="preserve">Quit Merging?</w:t>
-            </w:r>
-          </w:p>
-        </w:tc>
-        <w:tc>
-          <w:tcPr/>
-          <w:p>
-            <w:pPr>
-              <w:pStyle w:val="Compact"/>
-            </w:pPr>
-            <w:r>
-              <w:t xml:space="preserve">Are you sure you want to quit and discard the changes?</w:t>
-            </w:r>
-          </w:p>
-        </w:tc>
-        <w:tc>
-          <w:tcPr/>
-          <w:p>
-            <w:pPr>
-              <w:pStyle w:val="Compact"/>
-            </w:pPr>
-            <w:r>
-              <w:t xml:space="preserve">[Cancel, Quit]</w:t>
+              <w:t xml:space="preserve">Direct back to Editor (edits preserved)</w:t>
             </w:r>
           </w:p>
         </w:tc>
@@ -4274,7 +4539,7 @@
               <w:pStyle w:val="Compact"/>
             </w:pPr>
             <w:r>
-              <w:t xml:space="preserve">Extract</w:t>
+              <w:t xml:space="preserve">Progress (converting)</w:t>
             </w:r>
           </w:p>
         </w:tc>
@@ -4285,40 +4550,7 @@
               <w:pStyle w:val="Compact"/>
             </w:pPr>
             <w:r>
-              <w:t xml:space="preserve">Extract PDF</w:t>
-            </w:r>
-          </w:p>
-        </w:tc>
-        <w:tc>
-          <w:tcPr/>
-          <w:p>
-            <w:pPr>
-              <w:pStyle w:val="Compact"/>
-            </w:pPr>
-            <w:r>
-              <w:t xml:space="preserve">Quit?</w:t>
-            </w:r>
-          </w:p>
-        </w:tc>
-        <w:tc>
-          <w:tcPr/>
-          <w:p>
-            <w:pPr>
-              <w:pStyle w:val="Compact"/>
-            </w:pPr>
-            <w:r>
-              <w:t xml:space="preserve">Are you sure you want to quit and discard the changes?</w:t>
-            </w:r>
-          </w:p>
-        </w:tc>
-        <w:tc>
-          <w:tcPr/>
-          <w:p>
-            <w:pPr>
-              <w:pStyle w:val="Compact"/>
-            </w:pPr>
-            <w:r>
-              <w:t xml:space="preserve">[Cancel, Quit]</w:t>
+              <w:t xml:space="preserve">No cancel — wait for completion, auto-navigates to Done</w:t>
             </w:r>
           </w:p>
         </w:tc>
@@ -4331,7 +4563,7 @@
               <w:pStyle w:val="Compact"/>
             </w:pPr>
             <w:r>
-              <w:t xml:space="preserve">Capture</w:t>
+              <w:t xml:space="preserve">Done page</w:t>
             </w:r>
           </w:p>
         </w:tc>
@@ -4342,7 +4574,45 @@
               <w:pStyle w:val="Compact"/>
             </w:pPr>
             <w:r>
-              <w:t xml:space="preserve">Scan to PDF</w:t>
+              <w:t xml:space="preserve">Direct back to home, no dialog</w:t>
+            </w:r>
+          </w:p>
+        </w:tc>
+      </w:tr>
+    </w:tbl>
+    <w:bookmarkEnd w:id="54"/>
+    <w:bookmarkStart w:id="55" w:name="scan-to-pdf-camera"/>
+    <w:p>
+      <w:pPr>
+        <w:pStyle w:val="Heading3"/>
+      </w:pPr>
+      <w:r>
+        <w:t xml:space="preserve">Scan to PDF — Camera</w:t>
+      </w:r>
+    </w:p>
+    <w:tbl>
+      <w:tblPr>
+        <w:tblStyle w:val="Table"/>
+        <w:tblW w:type="pct" w:w="5000"/>
+        <w:tblLayout w:type="fixed"/>
+        <w:tblLook w:firstRow="1" w:lastRow="0" w:firstColumn="0" w:lastColumn="0" w:noHBand="0" w:noVBand="0" w:val="0020"/>
+      </w:tblPr>
+      <w:tblGrid>
+        <w:gridCol w:w="3655"/>
+        <w:gridCol w:w="4264"/>
+      </w:tblGrid>
+      <w:tr>
+        <w:trPr>
+          <w:tblHeader w:val="on"/>
+        </w:trPr>
+        <w:tc>
+          <w:tcPr/>
+          <w:p>
+            <w:pPr>
+              <w:pStyle w:val="Compact"/>
+            </w:pPr>
+            <w:r>
+              <w:t xml:space="preserve">User is on</w:t>
             </w:r>
           </w:p>
         </w:tc>
@@ -4353,29 +4623,7 @@
               <w:pStyle w:val="Compact"/>
             </w:pPr>
             <w:r>
-              <w:t xml:space="preserve">Discard photos?</w:t>
-            </w:r>
-          </w:p>
-        </w:tc>
-        <w:tc>
-          <w:tcPr/>
-          <w:p>
-            <w:pPr>
-              <w:pStyle w:val="Compact"/>
-            </w:pPr>
-            <w:r>
-              <w:t xml:space="preserve">Your captured photos will not be saved.</w:t>
-            </w:r>
-          </w:p>
-        </w:tc>
-        <w:tc>
-          <w:tcPr/>
-          <w:p>
-            <w:pPr>
-              <w:pStyle w:val="Compact"/>
-            </w:pPr>
-            <w:r>
-              <w:t xml:space="preserve">[Cancel, Discard]</w:t>
+              <w:t xml:space="preserve">Back behavior</w:t>
             </w:r>
           </w:p>
         </w:tc>
@@ -4388,7 +4636,7 @@
               <w:pStyle w:val="Compact"/>
             </w:pPr>
             <w:r>
-              <w:t xml:space="preserve">Capture</w:t>
+              <w:t xml:space="preserve">Camera (no photos taken)</w:t>
             </w:r>
           </w:p>
         </w:tc>
@@ -4399,7 +4647,20 @@
               <w:pStyle w:val="Compact"/>
             </w:pPr>
             <w:r>
-              <w:t xml:space="preserve">ID Card Scan</w:t>
+              <w:t xml:space="preserve">Direct back to home</w:t>
+            </w:r>
+          </w:p>
+        </w:tc>
+      </w:tr>
+      <w:tr>
+        <w:tc>
+          <w:tcPr/>
+          <w:p>
+            <w:pPr>
+              <w:pStyle w:val="Compact"/>
+            </w:pPr>
+            <w:r>
+              <w:t xml:space="preserve">Camera (has captured photos)</w:t>
             </w:r>
           </w:p>
         </w:tc>
@@ -4410,7 +4671,69 @@
               <w:pStyle w:val="Compact"/>
             </w:pPr>
             <w:r>
-              <w:t xml:space="preserve">Quit?</w:t>
+              <w:t xml:space="preserve">Dialog:</w:t>
+            </w:r>
+            <w:r>
+              <w:t xml:space="preserve"> </w:t>
+            </w:r>
+            <w:r>
+              <w:t xml:space="preserve">“Discard photos?”</w:t>
+            </w:r>
+            <w:r>
+              <w:t xml:space="preserve"> </w:t>
+            </w:r>
+            <w:r>
+              <w:t xml:space="preserve">/</w:t>
+            </w:r>
+            <w:r>
+              <w:t xml:space="preserve"> </w:t>
+            </w:r>
+            <w:r>
+              <w:t xml:space="preserve">“Your captured photos will not be saved.”</w:t>
+            </w:r>
+            <w:r>
+              <w:t xml:space="preserve"> </w:t>
+            </w:r>
+            <w:r>
+              <w:t xml:space="preserve">/ [Cancel, Discard]</w:t>
+            </w:r>
+          </w:p>
+        </w:tc>
+      </w:tr>
+    </w:tbl>
+    <w:bookmarkEnd w:id="55"/>
+    <w:bookmarkStart w:id="56" w:name="id-card-scan-1"/>
+    <w:p>
+      <w:pPr>
+        <w:pStyle w:val="Heading3"/>
+      </w:pPr>
+      <w:r>
+        <w:t xml:space="preserve">ID Card Scan</w:t>
+      </w:r>
+    </w:p>
+    <w:tbl>
+      <w:tblPr>
+        <w:tblStyle w:val="Table"/>
+        <w:tblW w:type="pct" w:w="5000"/>
+        <w:tblLayout w:type="fixed"/>
+        <w:tblLook w:firstRow="1" w:lastRow="0" w:firstColumn="0" w:lastColumn="0" w:noHBand="0" w:noVBand="0" w:val="0020"/>
+      </w:tblPr>
+      <w:tblGrid>
+        <w:gridCol w:w="3655"/>
+        <w:gridCol w:w="4264"/>
+      </w:tblGrid>
+      <w:tr>
+        <w:trPr>
+          <w:tblHeader w:val="on"/>
+        </w:trPr>
+        <w:tc>
+          <w:tcPr/>
+          <w:p>
+            <w:pPr>
+              <w:pStyle w:val="Compact"/>
+            </w:pPr>
+            <w:r>
+              <w:t xml:space="preserve">User is on</w:t>
             </w:r>
           </w:p>
         </w:tc>
@@ -4421,7 +4744,20 @@
               <w:pStyle w:val="Compact"/>
             </w:pPr>
             <w:r>
-              <w:t xml:space="preserve">Your current progress will be lost. Are you sure you want to quit?</w:t>
+              <w:t xml:space="preserve">Back behavior</w:t>
+            </w:r>
+          </w:p>
+        </w:tc>
+      </w:tr>
+      <w:tr>
+        <w:tc>
+          <w:tcPr/>
+          <w:p>
+            <w:pPr>
+              <w:pStyle w:val="Compact"/>
+            </w:pPr>
+            <w:r>
+              <w:t xml:space="preserve">Mode Select page</w:t>
             </w:r>
           </w:p>
         </w:tc>
@@ -4432,12 +4768,852 @@
               <w:pStyle w:val="Compact"/>
             </w:pPr>
             <w:r>
-              <w:t xml:space="preserve">[Cancel, Quit]</w:t>
+              <w:t xml:space="preserve">Direct back to home</w:t>
+            </w:r>
+          </w:p>
+        </w:tc>
+      </w:tr>
+      <w:tr>
+        <w:tc>
+          <w:tcPr/>
+          <w:p>
+            <w:pPr>
+              <w:pStyle w:val="Compact"/>
+            </w:pPr>
+            <w:r>
+              <w:t xml:space="preserve">Camera (no photo taken)</w:t>
+            </w:r>
+          </w:p>
+        </w:tc>
+        <w:tc>
+          <w:tcPr/>
+          <w:p>
+            <w:pPr>
+              <w:pStyle w:val="Compact"/>
+            </w:pPr>
+            <w:r>
+              <w:t xml:space="preserve">Direct back to Mode Select (mode reset, Album &amp; capture buttons disabled until Start Scan again)</w:t>
+            </w:r>
+          </w:p>
+        </w:tc>
+      </w:tr>
+      <w:tr>
+        <w:tc>
+          <w:tcPr/>
+          <w:p>
+            <w:pPr>
+              <w:pStyle w:val="Compact"/>
+            </w:pPr>
+            <w:r>
+              <w:t xml:space="preserve">Camera (front captured, back not yet)</w:t>
+            </w:r>
+          </w:p>
+        </w:tc>
+        <w:tc>
+          <w:tcPr/>
+          <w:p>
+            <w:pPr>
+              <w:pStyle w:val="Compact"/>
+            </w:pPr>
+            <w:r>
+              <w:t xml:space="preserve">Dialog:</w:t>
+            </w:r>
+            <w:r>
+              <w:t xml:space="preserve"> </w:t>
+            </w:r>
+            <w:r>
+              <w:t xml:space="preserve">“Discard photo?”</w:t>
+            </w:r>
+            <w:r>
+              <w:t xml:space="preserve"> </w:t>
+            </w:r>
+            <w:r>
+              <w:t xml:space="preserve">/</w:t>
+            </w:r>
+            <w:r>
+              <w:t xml:space="preserve"> </w:t>
+            </w:r>
+            <w:r>
+              <w:t xml:space="preserve">“Your captured front side photo will not be saved.”</w:t>
+            </w:r>
+            <w:r>
+              <w:t xml:space="preserve"> </w:t>
+            </w:r>
+            <w:r>
+              <w:t xml:space="preserve">/ [Cancel, Discard] → Discard returns to Mode Select with mode reset</w:t>
+            </w:r>
+          </w:p>
+        </w:tc>
+      </w:tr>
+      <w:tr>
+        <w:tc>
+          <w:tcPr/>
+          <w:p>
+            <w:pPr>
+              <w:pStyle w:val="Compact"/>
+            </w:pPr>
+            <w:r>
+              <w:t xml:space="preserve">Album Picker (selecting images)</w:t>
+            </w:r>
+          </w:p>
+        </w:tc>
+        <w:tc>
+          <w:tcPr/>
+          <w:p>
+            <w:pPr>
+              <w:pStyle w:val="Compact"/>
+            </w:pPr>
+            <w:r>
+              <w:t xml:space="preserve">Direct back to Camera</w:t>
+            </w:r>
+          </w:p>
+        </w:tc>
+      </w:tr>
+      <w:tr>
+        <w:tc>
+          <w:tcPr/>
+          <w:p>
+            <w:pPr>
+              <w:pStyle w:val="Compact"/>
+            </w:pPr>
+            <w:r>
+              <w:t xml:space="preserve">Preview (has front/back)</w:t>
+            </w:r>
+          </w:p>
+        </w:tc>
+        <w:tc>
+          <w:tcPr/>
+          <w:p>
+            <w:pPr>
+              <w:pStyle w:val="Compact"/>
+            </w:pPr>
+            <w:r>
+              <w:t xml:space="preserve">Dialog:</w:t>
+            </w:r>
+            <w:r>
+              <w:t xml:space="preserve"> </w:t>
+            </w:r>
+            <w:r>
+              <w:t xml:space="preserve">“Quit?”</w:t>
+            </w:r>
+            <w:r>
+              <w:t xml:space="preserve"> </w:t>
+            </w:r>
+            <w:r>
+              <w:t xml:space="preserve">/</w:t>
+            </w:r>
+            <w:r>
+              <w:t xml:space="preserve"> </w:t>
+            </w:r>
+            <w:r>
+              <w:t xml:space="preserve">“Your current progress will be lost.”</w:t>
+            </w:r>
+            <w:r>
+              <w:t xml:space="preserve"> </w:t>
+            </w:r>
+            <w:r>
+              <w:t xml:space="preserve">/ [Cancel, Quit]</w:t>
+            </w:r>
+          </w:p>
+        </w:tc>
+      </w:tr>
+      <w:tr>
+        <w:tc>
+          <w:tcPr/>
+          <w:p>
+            <w:pPr>
+              <w:pStyle w:val="Compact"/>
+            </w:pPr>
+            <w:r>
+              <w:t xml:space="preserve">Edit page</w:t>
+            </w:r>
+          </w:p>
+        </w:tc>
+        <w:tc>
+          <w:tcPr/>
+          <w:p>
+            <w:pPr>
+              <w:pStyle w:val="Compact"/>
+            </w:pPr>
+            <w:r>
+              <w:t xml:space="preserve">Direct back to preview (edits are saved)</w:t>
+            </w:r>
+          </w:p>
+        </w:tc>
+      </w:tr>
+      <w:tr>
+        <w:tc>
+          <w:tcPr/>
+          <w:p>
+            <w:pPr>
+              <w:pStyle w:val="Compact"/>
+            </w:pPr>
+            <w:r>
+              <w:t xml:space="preserve">Progress</w:t>
+            </w:r>
+          </w:p>
+        </w:tc>
+        <w:tc>
+          <w:tcPr/>
+          <w:p>
+            <w:pPr>
+              <w:pStyle w:val="Compact"/>
+            </w:pPr>
+            <w:r>
+              <w:t xml:space="preserve">No cancel — wait for completion, auto-navigates to Done</w:t>
+            </w:r>
+          </w:p>
+        </w:tc>
+      </w:tr>
+      <w:tr>
+        <w:tc>
+          <w:tcPr/>
+          <w:p>
+            <w:pPr>
+              <w:pStyle w:val="Compact"/>
+            </w:pPr>
+            <w:r>
+              <w:t xml:space="preserve">Done page</w:t>
+            </w:r>
+          </w:p>
+        </w:tc>
+        <w:tc>
+          <w:tcPr/>
+          <w:p>
+            <w:pPr>
+              <w:pStyle w:val="Compact"/>
+            </w:pPr>
+            <w:r>
+              <w:t xml:space="preserve">Direct back to home</w:t>
             </w:r>
           </w:p>
         </w:tc>
       </w:tr>
     </w:tbl>
+    <w:bookmarkEnd w:id="56"/>
+    <w:bookmarkStart w:id="57" w:name="pdf-to-image-pdf-to-long-image"/>
+    <w:p>
+      <w:pPr>
+        <w:pStyle w:val="Heading3"/>
+      </w:pPr>
+      <w:r>
+        <w:t xml:space="preserve">PDF to Image / PDF to Long Image</w:t>
+      </w:r>
+    </w:p>
+    <w:tbl>
+      <w:tblPr>
+        <w:tblStyle w:val="Table"/>
+        <w:tblW w:type="auto" w:w="0"/>
+        <w:tblLook w:firstRow="1" w:lastRow="0" w:firstColumn="0" w:lastColumn="0" w:noHBand="0" w:noVBand="0" w:val="0020"/>
+      </w:tblPr>
+      <w:tblGrid>
+        <w:gridCol w:w="3960"/>
+        <w:gridCol w:w="3960"/>
+      </w:tblGrid>
+      <w:tr>
+        <w:trPr>
+          <w:tblHeader w:val="on"/>
+        </w:trPr>
+        <w:tc>
+          <w:tcPr/>
+          <w:p>
+            <w:pPr>
+              <w:pStyle w:val="Compact"/>
+            </w:pPr>
+            <w:r>
+              <w:t xml:space="preserve">User is on</w:t>
+            </w:r>
+          </w:p>
+        </w:tc>
+        <w:tc>
+          <w:tcPr/>
+          <w:p>
+            <w:pPr>
+              <w:pStyle w:val="Compact"/>
+            </w:pPr>
+            <w:r>
+              <w:t xml:space="preserve">Back behavior</w:t>
+            </w:r>
+          </w:p>
+        </w:tc>
+      </w:tr>
+      <w:tr>
+        <w:tc>
+          <w:tcPr/>
+          <w:p>
+            <w:pPr>
+              <w:pStyle w:val="Compact"/>
+            </w:pPr>
+            <w:r>
+              <w:t xml:space="preserve">Select File</w:t>
+            </w:r>
+          </w:p>
+        </w:tc>
+        <w:tc>
+          <w:tcPr/>
+          <w:p>
+            <w:pPr>
+              <w:pStyle w:val="Compact"/>
+            </w:pPr>
+            <w:r>
+              <w:t xml:space="preserve">Direct back to home</w:t>
+            </w:r>
+          </w:p>
+        </w:tc>
+      </w:tr>
+      <w:tr>
+        <w:tc>
+          <w:tcPr/>
+          <w:p>
+            <w:pPr>
+              <w:pStyle w:val="Compact"/>
+            </w:pPr>
+            <w:r>
+              <w:t xml:space="preserve">Select Pages</w:t>
+            </w:r>
+          </w:p>
+        </w:tc>
+        <w:tc>
+          <w:tcPr/>
+          <w:p>
+            <w:pPr>
+              <w:pStyle w:val="Compact"/>
+            </w:pPr>
+            <w:r>
+              <w:t xml:space="preserve">Direct back to Select File</w:t>
+            </w:r>
+          </w:p>
+        </w:tc>
+      </w:tr>
+      <w:tr>
+        <w:tc>
+          <w:tcPr/>
+          <w:p>
+            <w:pPr>
+              <w:pStyle w:val="Compact"/>
+            </w:pPr>
+            <w:r>
+              <w:t xml:space="preserve">Progress</w:t>
+            </w:r>
+          </w:p>
+        </w:tc>
+        <w:tc>
+          <w:tcPr/>
+          <w:p>
+            <w:pPr>
+              <w:pStyle w:val="Compact"/>
+            </w:pPr>
+            <w:r>
+              <w:t xml:space="preserve">No cancel — wait for completion, auto-navigates to Done</w:t>
+            </w:r>
+          </w:p>
+        </w:tc>
+      </w:tr>
+      <w:tr>
+        <w:tc>
+          <w:tcPr/>
+          <w:p>
+            <w:pPr>
+              <w:pStyle w:val="Compact"/>
+            </w:pPr>
+            <w:r>
+              <w:t xml:space="preserve">Done page</w:t>
+            </w:r>
+          </w:p>
+        </w:tc>
+        <w:tc>
+          <w:tcPr/>
+          <w:p>
+            <w:pPr>
+              <w:pStyle w:val="Compact"/>
+            </w:pPr>
+            <w:r>
+              <w:t xml:space="preserve">Direct back to home</w:t>
+            </w:r>
+          </w:p>
+        </w:tc>
+      </w:tr>
+    </w:tbl>
+    <w:bookmarkEnd w:id="57"/>
+    <w:bookmarkStart w:id="58" w:name="compress-pdf"/>
+    <w:p>
+      <w:pPr>
+        <w:pStyle w:val="Heading3"/>
+      </w:pPr>
+      <w:r>
+        <w:t xml:space="preserve">Compress PDF</w:t>
+      </w:r>
+    </w:p>
+    <w:tbl>
+      <w:tblPr>
+        <w:tblStyle w:val="Table"/>
+        <w:tblW w:type="auto" w:w="0"/>
+        <w:tblLook w:firstRow="1" w:lastRow="0" w:firstColumn="0" w:lastColumn="0" w:noHBand="0" w:noVBand="0" w:val="0020"/>
+      </w:tblPr>
+      <w:tblGrid>
+        <w:gridCol w:w="3960"/>
+        <w:gridCol w:w="3960"/>
+      </w:tblGrid>
+      <w:tr>
+        <w:trPr>
+          <w:tblHeader w:val="on"/>
+        </w:trPr>
+        <w:tc>
+          <w:tcPr/>
+          <w:p>
+            <w:pPr>
+              <w:pStyle w:val="Compact"/>
+            </w:pPr>
+            <w:r>
+              <w:t xml:space="preserve">User is on</w:t>
+            </w:r>
+          </w:p>
+        </w:tc>
+        <w:tc>
+          <w:tcPr/>
+          <w:p>
+            <w:pPr>
+              <w:pStyle w:val="Compact"/>
+            </w:pPr>
+            <w:r>
+              <w:t xml:space="preserve">Back behavior</w:t>
+            </w:r>
+          </w:p>
+        </w:tc>
+      </w:tr>
+      <w:tr>
+        <w:tc>
+          <w:tcPr/>
+          <w:p>
+            <w:pPr>
+              <w:pStyle w:val="Compact"/>
+            </w:pPr>
+            <w:r>
+              <w:t xml:space="preserve">Select File</w:t>
+            </w:r>
+          </w:p>
+        </w:tc>
+        <w:tc>
+          <w:tcPr/>
+          <w:p>
+            <w:pPr>
+              <w:pStyle w:val="Compact"/>
+            </w:pPr>
+            <w:r>
+              <w:t xml:space="preserve">Direct back to home</w:t>
+            </w:r>
+          </w:p>
+        </w:tc>
+      </w:tr>
+      <w:tr>
+        <w:tc>
+          <w:tcPr/>
+          <w:p>
+            <w:pPr>
+              <w:pStyle w:val="Compact"/>
+            </w:pPr>
+            <w:r>
+              <w:t xml:space="preserve">Choose Level</w:t>
+            </w:r>
+          </w:p>
+        </w:tc>
+        <w:tc>
+          <w:tcPr/>
+          <w:p>
+            <w:pPr>
+              <w:pStyle w:val="Compact"/>
+            </w:pPr>
+            <w:r>
+              <w:t xml:space="preserve">Direct back to Select File</w:t>
+            </w:r>
+          </w:p>
+        </w:tc>
+      </w:tr>
+      <w:tr>
+        <w:tc>
+          <w:tcPr/>
+          <w:p>
+            <w:pPr>
+              <w:pStyle w:val="Compact"/>
+            </w:pPr>
+            <w:r>
+              <w:t xml:space="preserve">Progress</w:t>
+            </w:r>
+          </w:p>
+        </w:tc>
+        <w:tc>
+          <w:tcPr/>
+          <w:p>
+            <w:pPr>
+              <w:pStyle w:val="Compact"/>
+            </w:pPr>
+            <w:r>
+              <w:t xml:space="preserve">No cancel — wait for completion, auto-navigates to Done</w:t>
+            </w:r>
+          </w:p>
+        </w:tc>
+      </w:tr>
+      <w:tr>
+        <w:tc>
+          <w:tcPr/>
+          <w:p>
+            <w:pPr>
+              <w:pStyle w:val="Compact"/>
+            </w:pPr>
+            <w:r>
+              <w:t xml:space="preserve">Done page</w:t>
+            </w:r>
+          </w:p>
+        </w:tc>
+        <w:tc>
+          <w:tcPr/>
+          <w:p>
+            <w:pPr>
+              <w:pStyle w:val="Compact"/>
+            </w:pPr>
+            <w:r>
+              <w:t xml:space="preserve">Direct back to home</w:t>
+            </w:r>
+          </w:p>
+        </w:tc>
+      </w:tr>
+    </w:tbl>
+    <w:bookmarkEnd w:id="58"/>
+    <w:bookmarkStart w:id="59" w:name="merge-pdf"/>
+    <w:p>
+      <w:pPr>
+        <w:pStyle w:val="Heading3"/>
+      </w:pPr>
+      <w:r>
+        <w:t xml:space="preserve">Merge PDF</w:t>
+      </w:r>
+    </w:p>
+    <w:tbl>
+      <w:tblPr>
+        <w:tblStyle w:val="Table"/>
+        <w:tblW w:type="auto" w:w="0"/>
+        <w:tblLook w:firstRow="1" w:lastRow="0" w:firstColumn="0" w:lastColumn="0" w:noHBand="0" w:noVBand="0" w:val="0020"/>
+      </w:tblPr>
+      <w:tblGrid>
+        <w:gridCol w:w="3960"/>
+        <w:gridCol w:w="3960"/>
+      </w:tblGrid>
+      <w:tr>
+        <w:trPr>
+          <w:tblHeader w:val="on"/>
+        </w:trPr>
+        <w:tc>
+          <w:tcPr/>
+          <w:p>
+            <w:pPr>
+              <w:pStyle w:val="Compact"/>
+            </w:pPr>
+            <w:r>
+              <w:t xml:space="preserve">User is on</w:t>
+            </w:r>
+          </w:p>
+        </w:tc>
+        <w:tc>
+          <w:tcPr/>
+          <w:p>
+            <w:pPr>
+              <w:pStyle w:val="Compact"/>
+            </w:pPr>
+            <w:r>
+              <w:t xml:space="preserve">Back behavior</w:t>
+            </w:r>
+          </w:p>
+        </w:tc>
+      </w:tr>
+      <w:tr>
+        <w:tc>
+          <w:tcPr/>
+          <w:p>
+            <w:pPr>
+              <w:pStyle w:val="Compact"/>
+            </w:pPr>
+            <w:r>
+              <w:t xml:space="preserve">Select Files</w:t>
+            </w:r>
+          </w:p>
+        </w:tc>
+        <w:tc>
+          <w:tcPr/>
+          <w:p>
+            <w:pPr>
+              <w:pStyle w:val="Compact"/>
+            </w:pPr>
+            <w:r>
+              <w:t xml:space="preserve">Direct back to home</w:t>
+            </w:r>
+          </w:p>
+        </w:tc>
+      </w:tr>
+      <w:tr>
+        <w:tc>
+          <w:tcPr/>
+          <w:p>
+            <w:pPr>
+              <w:pStyle w:val="Compact"/>
+            </w:pPr>
+            <w:r>
+              <w:t xml:space="preserve">Reorder page</w:t>
+            </w:r>
+          </w:p>
+        </w:tc>
+        <w:tc>
+          <w:tcPr/>
+          <w:p>
+            <w:pPr>
+              <w:pStyle w:val="Compact"/>
+            </w:pPr>
+            <w:r>
+              <w:t xml:space="preserve">Direct back to Select Files</w:t>
+            </w:r>
+          </w:p>
+        </w:tc>
+      </w:tr>
+      <w:tr>
+        <w:tc>
+          <w:tcPr/>
+          <w:p>
+            <w:pPr>
+              <w:pStyle w:val="Compact"/>
+            </w:pPr>
+            <w:r>
+              <w:t xml:space="preserve">Progress</w:t>
+            </w:r>
+          </w:p>
+        </w:tc>
+        <w:tc>
+          <w:tcPr/>
+          <w:p>
+            <w:pPr>
+              <w:pStyle w:val="Compact"/>
+            </w:pPr>
+            <w:r>
+              <w:t xml:space="preserve">No cancel — wait for completion, auto-navigates to Done</w:t>
+            </w:r>
+          </w:p>
+        </w:tc>
+      </w:tr>
+      <w:tr>
+        <w:tc>
+          <w:tcPr/>
+          <w:p>
+            <w:pPr>
+              <w:pStyle w:val="Compact"/>
+            </w:pPr>
+            <w:r>
+              <w:t xml:space="preserve">Done page</w:t>
+            </w:r>
+          </w:p>
+        </w:tc>
+        <w:tc>
+          <w:tcPr/>
+          <w:p>
+            <w:pPr>
+              <w:pStyle w:val="Compact"/>
+            </w:pPr>
+            <w:r>
+              <w:t xml:space="preserve">Direct back to home</w:t>
+            </w:r>
+          </w:p>
+        </w:tc>
+      </w:tr>
+    </w:tbl>
+    <w:bookmarkEnd w:id="59"/>
+    <w:bookmarkStart w:id="60" w:name="extract-pdf"/>
+    <w:p>
+      <w:pPr>
+        <w:pStyle w:val="Heading3"/>
+      </w:pPr>
+      <w:r>
+        <w:t xml:space="preserve">Extract PDF</w:t>
+      </w:r>
+    </w:p>
+    <w:tbl>
+      <w:tblPr>
+        <w:tblStyle w:val="Table"/>
+        <w:tblW w:type="auto" w:w="0"/>
+        <w:tblLook w:firstRow="1" w:lastRow="0" w:firstColumn="0" w:lastColumn="0" w:noHBand="0" w:noVBand="0" w:val="0020"/>
+      </w:tblPr>
+      <w:tblGrid>
+        <w:gridCol w:w="3960"/>
+        <w:gridCol w:w="3960"/>
+      </w:tblGrid>
+      <w:tr>
+        <w:trPr>
+          <w:tblHeader w:val="on"/>
+        </w:trPr>
+        <w:tc>
+          <w:tcPr/>
+          <w:p>
+            <w:pPr>
+              <w:pStyle w:val="Compact"/>
+            </w:pPr>
+            <w:r>
+              <w:t xml:space="preserve">User is on</w:t>
+            </w:r>
+          </w:p>
+        </w:tc>
+        <w:tc>
+          <w:tcPr/>
+          <w:p>
+            <w:pPr>
+              <w:pStyle w:val="Compact"/>
+            </w:pPr>
+            <w:r>
+              <w:t xml:space="preserve">Back behavior</w:t>
+            </w:r>
+          </w:p>
+        </w:tc>
+      </w:tr>
+      <w:tr>
+        <w:tc>
+          <w:tcPr/>
+          <w:p>
+            <w:pPr>
+              <w:pStyle w:val="Compact"/>
+            </w:pPr>
+            <w:r>
+              <w:t xml:space="preserve">Select File</w:t>
+            </w:r>
+          </w:p>
+        </w:tc>
+        <w:tc>
+          <w:tcPr/>
+          <w:p>
+            <w:pPr>
+              <w:pStyle w:val="Compact"/>
+            </w:pPr>
+            <w:r>
+              <w:t xml:space="preserve">Direct back to home</w:t>
+            </w:r>
+          </w:p>
+        </w:tc>
+      </w:tr>
+      <w:tr>
+        <w:tc>
+          <w:tcPr/>
+          <w:p>
+            <w:pPr>
+              <w:pStyle w:val="Compact"/>
+            </w:pPr>
+            <w:r>
+              <w:t xml:space="preserve">Select Pages</w:t>
+            </w:r>
+          </w:p>
+        </w:tc>
+        <w:tc>
+          <w:tcPr/>
+          <w:p>
+            <w:pPr>
+              <w:pStyle w:val="Compact"/>
+            </w:pPr>
+            <w:r>
+              <w:t xml:space="preserve">Direct back to Select File</w:t>
+            </w:r>
+          </w:p>
+        </w:tc>
+      </w:tr>
+      <w:tr>
+        <w:tc>
+          <w:tcPr/>
+          <w:p>
+            <w:pPr>
+              <w:pStyle w:val="Compact"/>
+            </w:pPr>
+            <w:r>
+              <w:t xml:space="preserve">Progress</w:t>
+            </w:r>
+          </w:p>
+        </w:tc>
+        <w:tc>
+          <w:tcPr/>
+          <w:p>
+            <w:pPr>
+              <w:pStyle w:val="Compact"/>
+            </w:pPr>
+            <w:r>
+              <w:t xml:space="preserve">No cancel — wait for completion, auto-navigates to Done</w:t>
+            </w:r>
+          </w:p>
+        </w:tc>
+      </w:tr>
+      <w:tr>
+        <w:tc>
+          <w:tcPr/>
+          <w:p>
+            <w:pPr>
+              <w:pStyle w:val="Compact"/>
+            </w:pPr>
+            <w:r>
+              <w:t xml:space="preserve">Done page</w:t>
+            </w:r>
+          </w:p>
+        </w:tc>
+        <w:tc>
+          <w:tcPr/>
+          <w:p>
+            <w:pPr>
+              <w:pStyle w:val="Compact"/>
+            </w:pPr>
+            <w:r>
+              <w:t xml:space="preserve">Direct back to home</w:t>
+            </w:r>
+          </w:p>
+        </w:tc>
+      </w:tr>
+    </w:tbl>
+    <w:bookmarkEnd w:id="60"/>
+    <w:bookmarkStart w:id="61" w:name="behavior-after-confirmation"/>
+    <w:p>
+      <w:pPr>
+        <w:pStyle w:val="Heading3"/>
+      </w:pPr>
+      <w:r>
+        <w:t xml:space="preserve">Behavior after confirmation</w:t>
+      </w:r>
+    </w:p>
+    <w:p>
+      <w:pPr>
+        <w:pStyle w:val="Compact"/>
+        <w:numPr>
+          <w:ilvl w:val="0"/>
+          <w:numId w:val="1029"/>
+        </w:numPr>
+      </w:pPr>
+      <w:r>
+        <w:rPr>
+          <w:b/>
+          <w:bCs/>
+        </w:rPr>
+        <w:t xml:space="preserve">User confirms quit/discard</w:t>
+      </w:r>
+      <w:r>
+        <w:t xml:space="preserve">: Returns to previous screen or home, any unsaved edits are lost</w:t>
+      </w:r>
+    </w:p>
+    <w:p>
+      <w:pPr>
+        <w:pStyle w:val="Compact"/>
+        <w:numPr>
+          <w:ilvl w:val="0"/>
+          <w:numId w:val="1029"/>
+        </w:numPr>
+      </w:pPr>
+      <w:r>
+        <w:rPr>
+          <w:b/>
+          <w:bCs/>
+        </w:rPr>
+        <w:t xml:space="preserve">User cancels</w:t>
+      </w:r>
+      <w:r>
+        <w:t xml:space="preserve">: Dialog closes, stays on current page</w:t>
+      </w:r>
+    </w:p>
     <w:p>
       <w:r>
         <w:pict>
@@ -4445,14 +5621,15 @@
         </w:pict>
       </w:r>
     </w:p>
-    <w:bookmarkEnd w:id="50"/>
-    <w:bookmarkStart w:id="51" w:name="file-search"/>
+    <w:bookmarkEnd w:id="61"/>
+    <w:bookmarkEnd w:id="62"/>
+    <w:bookmarkStart w:id="63" w:name="file-search"/>
     <w:p>
       <w:pPr>
         <w:pStyle w:val="Heading2"/>
       </w:pPr>
       <w:r>
-        <w:t xml:space="preserve">11. File Search</w:t>
+        <w:t xml:space="preserve">12. File Search</w:t>
       </w:r>
     </w:p>
     <w:p>
@@ -4560,14 +5737,14 @@
         </w:pict>
       </w:r>
     </w:p>
-    <w:bookmarkEnd w:id="51"/>
-    <w:bookmarkStart w:id="52" w:name="all-done-pages-unified-pattern"/>
+    <w:bookmarkEnd w:id="63"/>
+    <w:bookmarkStart w:id="64" w:name="all-done-pages-unified-pattern"/>
     <w:p>
       <w:pPr>
         <w:pStyle w:val="Heading2"/>
       </w:pPr>
       <w:r>
-        <w:t xml:space="preserve">12. All Done Pages — Unified Pattern</w:t>
+        <w:t xml:space="preserve">13. All Done Pages — Unified Pattern</w:t>
       </w:r>
     </w:p>
     <w:p>
@@ -4583,7 +5760,7 @@
         <w:pStyle w:val="Compact"/>
         <w:numPr>
           <w:ilvl w:val="0"/>
-          <w:numId w:val="1026"/>
+          <w:numId w:val="1030"/>
         </w:numPr>
       </w:pPr>
       <w:r>
@@ -4640,7 +5817,7 @@
         <w:pStyle w:val="Compact"/>
         <w:numPr>
           <w:ilvl w:val="0"/>
-          <w:numId w:val="1026"/>
+          <w:numId w:val="1030"/>
         </w:numPr>
       </w:pPr>
       <w:r>
@@ -4652,7 +5829,7 @@
         <w:pStyle w:val="Compact"/>
         <w:numPr>
           <w:ilvl w:val="0"/>
-          <w:numId w:val="1026"/>
+          <w:numId w:val="1030"/>
         </w:numPr>
       </w:pPr>
       <w:r>
@@ -4664,7 +5841,7 @@
         <w:pStyle w:val="Compact"/>
         <w:numPr>
           <w:ilvl w:val="0"/>
-          <w:numId w:val="1026"/>
+          <w:numId w:val="1030"/>
         </w:numPr>
       </w:pPr>
       <w:r>
@@ -4676,7 +5853,7 @@
         <w:pStyle w:val="Compact"/>
         <w:numPr>
           <w:ilvl w:val="0"/>
-          <w:numId w:val="1026"/>
+          <w:numId w:val="1030"/>
         </w:numPr>
       </w:pPr>
       <w:r>
@@ -4688,7 +5865,7 @@
         <w:pStyle w:val="Compact"/>
         <w:numPr>
           <w:ilvl w:val="0"/>
-          <w:numId w:val="1026"/>
+          <w:numId w:val="1030"/>
         </w:numPr>
       </w:pPr>
       <w:r>
@@ -4700,7 +5877,7 @@
         <w:pStyle w:val="Compact"/>
         <w:numPr>
           <w:ilvl w:val="0"/>
-          <w:numId w:val="1026"/>
+          <w:numId w:val="1030"/>
         </w:numPr>
       </w:pPr>
       <w:r>
@@ -4722,7 +5899,7 @@
         <w:pStyle w:val="Compact"/>
         <w:numPr>
           <w:ilvl w:val="0"/>
-          <w:numId w:val="1026"/>
+          <w:numId w:val="1030"/>
         </w:numPr>
       </w:pPr>
       <w:r>
@@ -4744,7 +5921,7 @@
         <w:pStyle w:val="Compact"/>
         <w:numPr>
           <w:ilvl w:val="0"/>
-          <w:numId w:val="1026"/>
+          <w:numId w:val="1030"/>
         </w:numPr>
       </w:pPr>
       <w:r>
@@ -4758,8 +5935,8 @@
         </w:pict>
       </w:r>
     </w:p>
-    <w:bookmarkEnd w:id="52"/>
-    <w:bookmarkStart w:id="53" w:name="key-differences-from-original-prd"/>
+    <w:bookmarkEnd w:id="64"/>
+    <w:bookmarkStart w:id="65" w:name="key-differences-from-original-prd"/>
     <w:p>
       <w:pPr>
         <w:pStyle w:val="Heading2"/>
@@ -4773,7 +5950,7 @@
         <w:pStyle w:val="Compact"/>
         <w:numPr>
           <w:ilvl w:val="0"/>
-          <w:numId w:val="1027"/>
+          <w:numId w:val="1031"/>
         </w:numPr>
       </w:pPr>
       <w:r>
@@ -4804,7 +5981,7 @@
         <w:pStyle w:val="Compact"/>
         <w:numPr>
           <w:ilvl w:val="0"/>
-          <w:numId w:val="1027"/>
+          <w:numId w:val="1031"/>
         </w:numPr>
       </w:pPr>
       <w:r>
@@ -4823,7 +6000,7 @@
         <w:pStyle w:val="Compact"/>
         <w:numPr>
           <w:ilvl w:val="0"/>
-          <w:numId w:val="1027"/>
+          <w:numId w:val="1031"/>
         </w:numPr>
       </w:pPr>
       <w:r>
@@ -4842,7 +6019,7 @@
         <w:pStyle w:val="Compact"/>
         <w:numPr>
           <w:ilvl w:val="0"/>
-          <w:numId w:val="1027"/>
+          <w:numId w:val="1031"/>
         </w:numPr>
       </w:pPr>
       <w:r>
@@ -4853,15 +6030,36 @@
         <w:t xml:space="preserve">ID Card Scan</w:t>
       </w:r>
       <w:r>
-        <w:t xml:space="preserve">: Privacy notice is a dialog overlay (not a separate page). Edit page supports left/right swipe between front/back. Retake only re-captures single image.</w:t>
-      </w:r>
-    </w:p>
-    <w:p>
-      <w:pPr>
-        <w:pStyle w:val="Compact"/>
-        <w:numPr>
-          <w:ilvl w:val="0"/>
-          <w:numId w:val="1027"/>
+        <w:t xml:space="preserve">: First page renamed to</w:t>
+      </w:r>
+      <w:r>
+        <w:t xml:space="preserve"> </w:t>
+      </w:r>
+      <w:r>
+        <w:t xml:space="preserve">“Mode Select”</w:t>
+      </w:r>
+      <w:r>
+        <w:t xml:space="preserve"> </w:t>
+      </w:r>
+      <w:r>
+        <w:t xml:space="preserve">(not</w:t>
+      </w:r>
+      <w:r>
+        <w:t xml:space="preserve"> </w:t>
+      </w:r>
+      <w:r>
+        <w:t xml:space="preserve">“Guide”</w:t>
+      </w:r>
+      <w:r>
+        <w:t xml:space="preserve">). Privacy notice is a dialog overlay. Album button opens a 2-image picker for ID Card/Passport modes (must select exactly 2). Back from capture with front captured shows discard dialog. Edit page supports left/right swipe. Retake only re-captures single image.</w:t>
+      </w:r>
+    </w:p>
+    <w:p>
+      <w:pPr>
+        <w:pStyle w:val="Compact"/>
+        <w:numPr>
+          <w:ilvl w:val="0"/>
+          <w:numId w:val="1031"/>
         </w:numPr>
       </w:pPr>
       <w:r>
@@ -4892,7 +6090,7 @@
         <w:pStyle w:val="Compact"/>
         <w:numPr>
           <w:ilvl w:val="0"/>
-          <w:numId w:val="1027"/>
+          <w:numId w:val="1031"/>
         </w:numPr>
       </w:pPr>
       <w:r>
@@ -4911,7 +6109,7 @@
         <w:pStyle w:val="Compact"/>
         <w:numPr>
           <w:ilvl w:val="0"/>
-          <w:numId w:val="1027"/>
+          <w:numId w:val="1031"/>
         </w:numPr>
       </w:pPr>
       <w:r>
@@ -4930,7 +6128,7 @@
         <w:pStyle w:val="Compact"/>
         <w:numPr>
           <w:ilvl w:val="0"/>
-          <w:numId w:val="1027"/>
+          <w:numId w:val="1031"/>
         </w:numPr>
       </w:pPr>
       <w:r>
@@ -4944,8 +6142,8 @@
         <w:t xml:space="preserve">: All unified with thumbnail preview, descriptive titles, Share (primary) / Open (secondary) pattern.</w:t>
       </w:r>
     </w:p>
-    <w:bookmarkEnd w:id="53"/>
-    <w:bookmarkEnd w:id="54"/>
+    <w:bookmarkEnd w:id="65"/>
+    <w:bookmarkEnd w:id="66"/>
     <w:sectPr>
       <w:footnotePr>
         <w:numRestart w:val="eachSect"/>
@@ -5326,6 +6524,18 @@
     <w:abstractNumId w:val="991"/>
   </w:num>
   <w:num w:numId="1027">
+    <w:abstractNumId w:val="991"/>
+  </w:num>
+  <w:num w:numId="1028">
+    <w:abstractNumId w:val="991"/>
+  </w:num>
+  <w:num w:numId="1029">
+    <w:abstractNumId w:val="991"/>
+  </w:num>
+  <w:num w:numId="1030">
+    <w:abstractNumId w:val="991"/>
+  </w:num>
+  <w:num w:numId="1031">
     <w:abstractNumId w:val="99411"/>
     <w:lvlOverride w:ilvl="0">
       <w:startOverride w:val="1"/>

</xml_diff>